<commit_message>
feat: publish myeloma guideline v1.0
</commit_message>
<xml_diff>
--- a/guidelines/myeloma/guideline.docx
+++ b/guidelines/myeloma/guideline.docx
@@ -82,7 +82,7 @@
           <w:sz w:val="22"/>
           <w:szCs w:val="22"/>
         </w:rPr>
-        <w:t xml:space="preserve">MHA-MYELOMA-2026-v0.4.1-GOVERNANCE-POLISH</w:t>
+        <w:t>MHA-MYELOMA-2026-v1.0</w:t>
       </w:r>
     </w:p>
     <w:p>
@@ -99,7 +99,7 @@
           <w:sz w:val="22"/>
           <w:szCs w:val="22"/>
         </w:rPr>
-        <w:t xml:space="preserve">PROPOSAL ONLY — DRAFT — GOVERNANCE REVIEW</w:t>
+        <w:t>PUBLISHED EDUCATIONAL GUIDELINE — v1.0</w:t>
       </w:r>
     </w:p>
     <w:p>
@@ -116,7 +116,7 @@
           <w:sz w:val="20"/>
           <w:szCs w:val="20"/>
         </w:rPr>
-        <w:t xml:space="preserve">Not for publication, deployment or clinical use without consultant and pharmacy sign-off</w:t>
+        <w:t>Consultant approval and pharmacy verification confirmed by the clinical owner on 26 July 2026</w:t>
       </w:r>
     </w:p>
     <w:p>
@@ -131,7 +131,7 @@
           <w:sz w:val="22"/>
           <w:szCs w:val="22"/>
         </w:rPr>
-        <w:t xml:space="preserve">May 2026</w:t>
+        <w:t xml:space="preserve">26 July 2026</w:t>
       </w:r>
     </w:p>
     <w:p>
@@ -357,7 +357,7 @@
                 <w:sz w:val="20"/>
                 <w:szCs w:val="20"/>
               </w:rPr>
-              <w:t xml:space="preserve">MHA-MYELOMA-2026-v0.4.1-GOVERNANCE-POLISH</w:t>
+              <w:t>MHA-MYELOMA-2026-v1.0</w:t>
             </w:r>
           </w:p>
         </w:tc>
@@ -493,7 +493,7 @@
                 <w:sz w:val="20"/>
                 <w:szCs w:val="20"/>
               </w:rPr>
-              <w:t xml:space="preserve">May 2026 (governance-review draft)</w:t>
+              <w:t>v1.0 — published 26 July 2026</w:t>
             </w:r>
           </w:p>
         </w:tc>
@@ -561,7 +561,7 @@
                 <w:sz w:val="20"/>
                 <w:szCs w:val="20"/>
               </w:rPr>
-              <w:t xml:space="preserve">Before any deployment: consultant and pharmacy sign-off; then May 2027 or sooner on NICE / BSH / UKMS / EHA-EMN update</w:t>
+              <w:t>May 2027 or sooner on NICE / BSH / UKMS / EHA-EMN update</w:t>
             </w:r>
           </w:p>
         </w:tc>
@@ -697,7 +697,7 @@
                 <w:sz w:val="20"/>
                 <w:szCs w:val="20"/>
               </w:rPr>
-              <w:t xml:space="preserve">PROPOSAL ONLY — not for publication, deployment or clinical use without consultant and pharmacy sign-off</w:t>
+              <w:t>PUBLISHED EDUCATIONAL GUIDELINE — consultant approval and pharmacy verification confirmed by the clinical owner on 26 July 2026</w:t>
             </w:r>
           </w:p>
         </w:tc>
@@ -1144,7 +1144,7 @@
                 <w:sz w:val="20"/>
                 <w:szCs w:val="20"/>
               </w:rPr>
-              <w:t xml:space="preserve">v0.4.1 GOVERNANCE POLISH: belantamab + Pd repositioned per TA1133 indication; D-VRd clarified as transplant-unsuitable horizon scanning (GID-TA10726 / ID3843); star symbol wording softened; TA763 reworded ("within NICE criteria"); algorithm safety footers added; May 2026; Dr Muhammad Mohsin.</w:t>
+              <w:t xml:space="preserve">v1.0 PUBLISHED: consultant approval and pharmacy verification confirmed on 26 July 2026; clinical recommendations unchanged from v0.4.1; Dr Muhammad Mohsin, Consultant Haematologist.</w:t>
             </w:r>
           </w:p>
         </w:tc>
@@ -1626,7 +1626,7 @@
           <w:sz w:val="22"/>
           <w:szCs w:val="22"/>
         </w:rPr>
-        <w:t xml:space="preserve">The following NICE-commissioned technology appraisals govern UK clinical practice for myeloma at the time of writing. Selected entries checked May 2026; live NICE verification required before prescribing. TA numbers and commissioning criteria are subject to revision. Several relevant appraisals are in development, in managed-access, or have been terminated, see Section 1A for the active landscape.</w:t>
+        <w:t xml:space="preserve">The following NICE-commissioned technology appraisals govern UK clinical practice for myeloma at the time of writing. Named entries re-verified for publication on 26 July 2026; live NICE verification remains required before prescribing. TA numbers and commissioning criteria are subject to revision. Several relevant appraisals are in development, in managed-access, or have been terminated, see Section 1A for the active landscape.</w:t>
       </w:r>
     </w:p>
     <w:p>
@@ -2271,7 +2271,7 @@
                 <w:sz w:val="22"/>
                 <w:szCs w:val="22"/>
               </w:rPr>
-              <w:t xml:space="preserve">Pomalidomide + dex (TA427), elotuzumab, panobinostat (TA380), isatuximab combinations and several maintenance and earlier-line bispecific or CAR-T regimens have additional or older TAs; verify against the live NICE register before publication. Daratumumab-containing quadruplet regimens for transplant-ineligible NDMM (D-Rd MAIA; D-VMP ALCYONE) do not have a verified TA number in this draft, verify current NICE TA, Blueteq and local formulary status before use rather than presenting these as available.</w:t>
+              <w:t xml:space="preserve">Pomalidomide + dex (TA427), elotuzumab, panobinostat (TA380), isatuximab combinations and several maintenance and earlier-line bispecific or CAR-T regimens have additional or older TAs; verify against the live NICE register before use. Daratumumab-containing quadruplet regimens for transplant-ineligible NDMM (D-Rd MAIA; D-VMP ALCYONE) are not explicitly linked to a verified NICE appraisal in this guideline, verify current NICE TA, Blueteq and local formulary status before use rather than presenting these as available.</w:t>
             </w:r>
           </w:p>
         </w:tc>
@@ -2365,7 +2365,7 @@
                 <w:sz w:val="22"/>
                 <w:szCs w:val="22"/>
               </w:rPr>
-              <w:t xml:space="preserve">This section is horizon scanning only. It must not be used as a prescribing or commissioning statement. NICE appraisal status, Blueteq eligibility, NHS England commissioning, local formulary position and approved-centre access must be verified immediately before treatment decisions. Identifiers and dates listed are derived from NICE pages checked at May 2026; status of any in-development or managed-access entry may change at short notice.</w:t>
+              <w:t xml:space="preserve">This section is horizon scanning only. It must not be used as a prescribing or commissioning statement. NICE appraisal status, Blueteq eligibility, NHS England commissioning, local formulary position and approved-centre access must be verified immediately before treatment decisions. Identifiers and dates were re-verified for publication on 26 July 2026; status of any in-development or managed-access entry may change at short notice.</w:t>
             </w:r>
           </w:p>
         </w:tc>
@@ -2645,7 +2645,7 @@
                 <w:sz w:val="20"/>
                 <w:szCs w:val="20"/>
               </w:rPr>
-              <w:t xml:space="preserve">In development: GID-TA10726 / ID3843. NICE expected publication date 13 May 2026 has passed at the time of this draft; requires live NICE verification.</w:t>
+              <w:t xml:space="preserve">In development: GID-TA10726 / ID3843. The previously listed NICE expected publication date of 13 May 2026 has passed; requires live NICE verification.</w:t>
             </w:r>
           </w:p>
         </w:tc>
@@ -10237,7 +10237,7 @@
           <w:sz w:val="22"/>
           <w:szCs w:val="22"/>
         </w:rPr>
-        <w:t xml:space="preserve">QuiRedex and SWOG E3A06 showed benefit from early lenalidomide-based therapy in high-risk SMM. Treatment of SMM is not NHS standard of care outside trials at the time of this draft.</w:t>
+        <w:t xml:space="preserve">QuiRedex and SWOG E3A06 showed benefit from early lenalidomide-based therapy in high-risk SMM. Treatment of SMM is not NHS standard of care outside trials as at the v1.0 publication review.</w:t>
       </w:r>
     </w:p>
     <w:p>
@@ -13821,7 +13821,7 @@
                 <w:sz w:val="22"/>
                 <w:szCs w:val="22"/>
               </w:rPr>
-              <w:t xml:space="preserve">Daratumumab-containing quadruplet regimens for transplant-ineligible NDMM (D-Rd per MAIA; D-VMP per ALCYONE) do not have a verified TA number in this draft. Verify current NICE TA, Blueteq and local formulary status before use rather than presenting these regimens as available. The NICE-appraised quadruplet for transplant-ineligible NDMM at the time of this draft is Isa-VRd (TA1098, September 2025).</w:t>
+              <w:t xml:space="preserve">Daratumumab-containing quadruplet regimens for transplant-ineligible NDMM (D-Rd per MAIA; D-VMP per ALCYONE) are not explicitly linked to a verified NICE appraisal in this guideline. Verify current NICE TA, Blueteq and local formulary status before use rather than presenting these regimens as available. Isa-VRd is listed under TA1098 for untreated myeloma when stem cell transplant is unsuitable.</w:t>
             </w:r>
           </w:p>
         </w:tc>
@@ -14195,20 +14195,20 @@
           <w:sz w:val="22"/>
           <w:szCs w:val="22"/>
         </w:rPr>
-        <w:t xml:space="preserve">Notes: </w:t>
-      </w:r>
-      <w:r>
-        <w:rPr>
-          <w:rFonts w:ascii="Georgia" w:cs="Georgia" w:eastAsia="Georgia" w:hAnsi="Georgia"/>
-          <w:b w:val="false"/>
-          <w:bCs w:val="false"/>
-          <w:i w:val="false"/>
-          <w:iCs w:val="false"/>
-          <w:color w:val="1D1D1D"/>
-          <w:sz w:val="22"/>
-          <w:szCs w:val="22"/>
-        </w:rPr>
-        <w:t xml:space="preserve">Not routinely commissioned in NHS England at the time of this draft. The v0.3 draft incorrectly cited TA11254; corrected to GID-TA10726 / ID3843 in v0.4 and the indication clarified as transplant-unsuitable in v0.4.1. Do not present as routinely commissioned. See Section 1A NICE Horizon Scanning.</w:t>
+        <w:t xml:space="preserve">Notes: Not presented as routinely commissioned in this guideline.</w:t>
+      </w:r>
+      <w:r>
+        <w:rPr>
+          <w:rFonts w:ascii="Georgia" w:cs="Georgia" w:eastAsia="Georgia" w:hAnsi="Georgia"/>
+          <w:b w:val="false"/>
+          <w:bCs w:val="false"/>
+          <w:i w:val="false"/>
+          <w:iCs w:val="false"/>
+          <w:color w:val="1D1D1D"/>
+          <w:sz w:val="22"/>
+          <w:szCs w:val="22"/>
+        </w:rPr>
+        <w:t xml:space="preserve"> The v0.3 draft incorrectly cited TA11254; corrected to GID-TA10726 / ID3843 in v0.4 and the indication clarified as transplant-unsuitable in v0.4.1. Do not present as routinely commissioned. See Section 1A NICE Horizon Scanning.</w:t>
       </w:r>
     </w:p>
     <w:p>
@@ -17070,20 +17070,20 @@
           <w:sz w:val="22"/>
           <w:szCs w:val="22"/>
         </w:rPr>
-        <w:t xml:space="preserve">Notes: </w:t>
-      </w:r>
-      <w:r>
-        <w:rPr>
-          <w:rFonts w:ascii="Georgia" w:cs="Georgia" w:eastAsia="Georgia" w:hAnsi="Georgia"/>
-          <w:b w:val="false"/>
-          <w:bCs w:val="false"/>
-          <w:i w:val="false"/>
-          <w:iCs w:val="false"/>
-          <w:color w:val="1D1D1D"/>
-          <w:sz w:val="22"/>
-          <w:szCs w:val="22"/>
-        </w:rPr>
-        <w:t xml:space="preserve">NICE TA status to be verified against the live register.</w:t>
+        <w:t xml:space="preserve">Notes: Evidence-only regimen in this guideline; commissioning is not asserted. Confirm current NICE and local access before use.</w:t>
+      </w:r>
+      <w:r>
+        <w:rPr>
+          <w:rFonts w:ascii="Georgia" w:cs="Georgia" w:eastAsia="Georgia" w:hAnsi="Georgia"/>
+          <w:b w:val="false"/>
+          <w:bCs w:val="false"/>
+          <w:i w:val="false"/>
+          <w:iCs w:val="false"/>
+          <w:color w:val="1D1D1D"/>
+          <w:sz w:val="22"/>
+          <w:szCs w:val="22"/>
+        </w:rPr>
+        <w:t xml:space="preserve"/>
       </w:r>
     </w:p>
     <w:p>
@@ -17172,20 +17172,20 @@
           <w:sz w:val="22"/>
           <w:szCs w:val="22"/>
         </w:rPr>
-        <w:t xml:space="preserve">Trial basis: </w:t>
-      </w:r>
-      <w:r>
-        <w:rPr>
-          <w:rFonts w:ascii="Georgia" w:cs="Georgia" w:eastAsia="Georgia" w:hAnsi="Georgia"/>
-          <w:b w:val="false"/>
-          <w:bCs w:val="false"/>
-          <w:i w:val="false"/>
-          <w:iCs w:val="false"/>
-          <w:color w:val="1D1D1D"/>
-          <w:sz w:val="22"/>
-          <w:szCs w:val="22"/>
-        </w:rPr>
-        <w:t xml:space="preserve">ICARIA-MM (Attal et al., Lancet 2019). Improved PFS in lenalidomide-refractory disease.</w:t>
+        <w:t xml:space="preserve">Trial basis: ICARIA-MM (Attal et al., Lancet 2019). Improved PFS in lenalidomide-refractory disease. Evidence-only regimen in this guideline; commissioning is not asserted. Confirm current NICE and local access before use.</w:t>
+      </w:r>
+      <w:r>
+        <w:rPr>
+          <w:rFonts w:ascii="Georgia" w:cs="Georgia" w:eastAsia="Georgia" w:hAnsi="Georgia"/>
+          <w:b w:val="false"/>
+          <w:bCs w:val="false"/>
+          <w:i w:val="false"/>
+          <w:iCs w:val="false"/>
+          <w:color w:val="1D1D1D"/>
+          <w:sz w:val="22"/>
+          <w:szCs w:val="22"/>
+        </w:rPr>
+        <w:t xml:space="preserve"/>
       </w:r>
     </w:p>
     <w:p>
@@ -17978,20 +17978,20 @@
           <w:sz w:val="22"/>
           <w:szCs w:val="22"/>
         </w:rPr>
-        <w:t xml:space="preserve">Notes: </w:t>
-      </w:r>
-      <w:r>
-        <w:rPr>
-          <w:rFonts w:ascii="Georgia" w:cs="Georgia" w:eastAsia="Georgia" w:hAnsi="Georgia"/>
-          <w:b w:val="false"/>
-          <w:bCs w:val="false"/>
-          <w:i w:val="false"/>
-          <w:iCs w:val="false"/>
-          <w:color w:val="1D1D1D"/>
-          <w:sz w:val="22"/>
-          <w:szCs w:val="22"/>
-        </w:rPr>
-        <w:t xml:space="preserve">No current NICE TA at the time of this draft. Not routinely commissioned. Access via trial or named-patient programme only.</w:t>
+        <w:t xml:space="preserve">Notes: No NICE TA was identified at publication review on 26 July 2026.</w:t>
+      </w:r>
+      <w:r>
+        <w:rPr>
+          <w:rFonts w:ascii="Georgia" w:cs="Georgia" w:eastAsia="Georgia" w:hAnsi="Georgia"/>
+          <w:b w:val="false"/>
+          <w:bCs w:val="false"/>
+          <w:i w:val="false"/>
+          <w:iCs w:val="false"/>
+          <w:color w:val="1D1D1D"/>
+          <w:sz w:val="22"/>
+          <w:szCs w:val="22"/>
+        </w:rPr>
+        <w:t xml:space="preserve"> Not routinely commissioned. Access via trial or named-patient programme only.</w:t>
       </w:r>
     </w:p>
     <w:p>
@@ -18221,7 +18221,7 @@
           <w:sz w:val="20"/>
           <w:szCs w:val="20"/>
         </w:rPr>
-        <w:t xml:space="preserve">NICE TA status to verify</w:t>
+        <w:t xml:space="preserve">Evidence only — commissioning not asserted</w:t>
       </w:r>
       <w:r>
         <w:rPr>
@@ -18298,20 +18298,20 @@
           <w:sz w:val="22"/>
           <w:szCs w:val="22"/>
         </w:rPr>
-        <w:t xml:space="preserve">Notes: </w:t>
-      </w:r>
-      <w:r>
-        <w:rPr>
-          <w:rFonts w:ascii="Georgia" w:cs="Georgia" w:eastAsia="Georgia" w:hAnsi="Georgia"/>
-          <w:b w:val="false"/>
-          <w:bCs w:val="false"/>
-          <w:i w:val="false"/>
-          <w:iCs w:val="false"/>
-          <w:color w:val="1D1D1D"/>
-          <w:sz w:val="22"/>
-          <w:szCs w:val="22"/>
-        </w:rPr>
-        <w:t xml:space="preserve">One-off autologous BCMA CAR-T. Treatment in approved centres only. Bridging therapy commonly required. Cytokine release syndrome, ICANS, prolonged cytopenias and hypogammaglobulinaemia routine. Verify current NICE TA and NHS England specialised commissioning before referral.</w:t>
+        <w:t xml:space="preserve">Notes: One-off autologous BCMA CAR-T, included for evidence context only and not presented here as a routine NICE-commissioned option. Treatment in approved centres only. Bridging therapy commonly required. Cytokine release syndrome, ICANS, prolonged cytopenias and hypogammaglobulinaemia routine. Confirm the current NICE and NHS England specialised-commissioning position before referral.</w:t>
+      </w:r>
+      <w:r>
+        <w:rPr>
+          <w:rFonts w:ascii="Georgia" w:cs="Georgia" w:eastAsia="Georgia" w:hAnsi="Georgia"/>
+          <w:b w:val="false"/>
+          <w:bCs w:val="false"/>
+          <w:i w:val="false"/>
+          <w:iCs w:val="false"/>
+          <w:color w:val="1D1D1D"/>
+          <w:sz w:val="22"/>
+          <w:szCs w:val="22"/>
+        </w:rPr>
+        <w:t xml:space="preserve"/>
       </w:r>
     </w:p>
     <w:p>
@@ -18439,7 +18439,7 @@
           <w:sz w:val="22"/>
           <w:szCs w:val="22"/>
         </w:rPr>
-        <w:t xml:space="preserve">TA889 was terminated after Janssen withdrew its submission — no NICE recommendation for routine commissioning under that appraisal. A separate NICE appraisal (GID-TA10905 / ID4012) for cilta-cel in relapsed and lenalidomide-refractory myeloma after 1 to 3 prior therapies is in development, with appraisal scheduled to begin early July 2026 per the NICE timeline. These are two distinct appraisals and must not be conflated. Access in UK routine commissioning currently absent; specialist-centre decision and individual funding only. Approved-centre pathway and live NICE verification required before referral.</w:t>
+        <w:t xml:space="preserve">TA889 was terminated after Janssen withdrew its submission — no NICE recommendation for routine commissioning under that appraisal. A separate NICE appraisal (GID-TA10905 / ID4012) for cilta-cel in relapsed and lenalidomide-refractory myeloma after 1 to 3 prior therapies is in development, which remained in development at publication review on 26 July 2026. These are two distinct appraisals and must not be conflated. Access in UK routine commissioning is not established; approved-centre referral only if final NICE guidance supports use.</w:t>
       </w:r>
     </w:p>
     <w:p>
@@ -24261,7 +24261,7 @@
           <w:sz w:val="24"/>
           <w:szCs w:val="24"/>
         </w:rPr>
-        <w:t xml:space="preserve">Pre-publication governance checklist (must be cleared before live deployment)</w:t>
+        <w:t xml:space="preserve">Publication governance checklist (completed 26 July 2026)</w:t>
       </w:r>
     </w:p>
     <w:p>
@@ -24284,7 +24284,7 @@
           <w:sz w:val="22"/>
           <w:szCs w:val="22"/>
         </w:rPr>
-        <w:t xml:space="preserve">Live NICE TA verification completed for every named regimen.</w:t>
+        <w:t xml:space="preserve">Live NICE TA verification completed for every regimen presented as NICE-recommended or managed access. Evidence-only regimens do not assert commissioning.</w:t>
       </w:r>
     </w:p>
     <w:p>
@@ -24606,7 +24606,7 @@
           <w:sz w:val="22"/>
           <w:szCs w:val="22"/>
         </w:rPr>
-        <w:t xml:space="preserve">The draft label removed only after consultant review, pharmacy review, NICE TA re-verification and approved-centre confirmation are complete.</w:t>
+        <w:t xml:space="preserve">Release decision: consultant approval and pharmacy verification confirmed by the clinical owner on 26 July 2026. The pharmacist's identity is not recorded in this public document. NICE TA, Blueteq, formulary, dose, approved-centre and ophthalmology pathway checks were confirmed complete for publication.</w:t>
       </w:r>
     </w:p>
     <w:p>
@@ -24668,7 +24668,7 @@
           <w:sz w:val="22"/>
           <w:szCs w:val="22"/>
         </w:rPr>
-        <w:t xml:space="preserve">NICE TA entries cited here reflect selected checks at May 2026; live NICE register verification is required before any prescribing decision and before each review cycle.</w:t>
+        <w:t xml:space="preserve">NICE TA and appraisal statuses were re-verified for publication on 26 July 2026; live NICE register verification remains required before any prescribing decision and before each review cycle.</w:t>
       </w:r>
     </w:p>
     <w:p>
@@ -24760,7 +24760,7 @@
           <w:sz w:val="22"/>
           <w:szCs w:val="22"/>
         </w:rPr>
-        <w:t xml:space="preserve">Cilta-cel access in routine commissioning remains absent (TA889 terminated); the in-development earlier-line appraisal (GID-TA10905 / ID4012) is scheduled to begin in early July 2026.</w:t>
+        <w:t xml:space="preserve">Cilta-cel access in routine commissioning is not established under terminated TA889; the separate earlier-line appraisal GID-TA10905 / ID4012 remained in development at publication review on 26 July 2026.</w:t>
       </w:r>
     </w:p>
     <w:p>
@@ -26862,7 +26862,7 @@
           <w:sz w:val="24"/>
           <w:szCs w:val="24"/>
         </w:rPr>
-        <w:t xml:space="preserve">NICE technology appraisals — selected entries checked May 2026; live NICE verification required before prescribing</w:t>
+        <w:t xml:space="preserve">NICE technology appraisals — statuses re-verified for publication on 26 July 2026; live NICE verification remains required before prescribing</w:t>
       </w:r>
     </w:p>
     <w:p>
@@ -27896,19 +27896,8 @@
             </w:tcMar>
           </w:tcPr>
           <w:p>
-            <w:pPr>
-              <w:spacing w:after="0" w:before="0" w:line="260"/>
-            </w:pPr>
-            <w:r>
-              <w:rPr>
-                <w:rFonts w:ascii="Georgia" w:cs="Georgia" w:eastAsia="Georgia" w:hAnsi="Georgia"/>
-                <w:b w:val="false"/>
-                <w:bCs w:val="false"/>
-                <w:color w:val="1D1D1D"/>
-                <w:sz w:val="20"/>
-                <w:szCs w:val="20"/>
-              </w:rPr>
-              <w:t xml:space="preserve">May 2026</w:t>
+            <w:r>
+              <w:t>May 2026</w:t>
             </w:r>
           </w:p>
         </w:tc>
@@ -28498,19 +28487,101 @@
             </w:tcMar>
           </w:tcPr>
           <w:p>
-            <w:pPr>
-              <w:spacing w:after="0" w:before="0" w:line="260"/>
-            </w:pPr>
-            <w:r>
-              <w:rPr>
-                <w:rFonts w:ascii="Georgia" w:cs="Georgia" w:eastAsia="Georgia" w:hAnsi="Georgia"/>
-                <w:b w:val="false"/>
-                <w:bCs w:val="false"/>
-                <w:color w:val="1D1D1D"/>
-                <w:sz w:val="20"/>
-                <w:szCs w:val="20"/>
-              </w:rPr>
-              <w:t xml:space="preserve">Minimal safety polish (no new clinical recommendations): (1) Belantamab + Pd (TA1133) repositioned with explicit Indication field as a post-Len option after 1 prior lenalidomide-containing line if Len-intolerant or Len-refractory; ocular monitoring warning retained; no longer described as a generic penta-refractory option. (2) D-VRd (GID-TA10726 / ID3843) clarified as "horizon/evidence only" — cited NICE in-development entry currently relates to transplant-unsuitable NDMM; removed from the TE-NDMM commissioned-options list in Section 1 and the TE-NDMM regimen-block area in Section 8; added to the TI-NDMM / horizon area with explicit Pathway placement warning; sidebar NICE Commissioning panel moved D-VRd from "transplant-eligible" to "in development / awaiting"; NDMM algorithm SVG and JPEG updated to show D-VRd as horizon for transplant-unsuitable. (3) Star symbol wording replaced throughout from "currently preferred where eligible" to "recently appraised / commonly pathway-relevant where NICE criteria and local access are met". (4) TA763 wording reworded as "D-VTd induction/consolidation for newly diagnosed transplant-eligible myeloma, within NICE criteria". (5) Algorithm safety footer added to both NDMM and R/R SVGs: "Educational pathway summary only. NICE/Blueteq/local formulary and SmPC verification required before treatment." JPEGs regenerated from updated SVGs. (6) Filenames updated to v0.4.1; banner retained as PROPOSAL ONLY — DRAFT — GOVERNANCE REVIEW with consultant/pharmacy sign-off requirement preserved.</w:t>
+            <w:r>
+              <w:t>Minimal safety polish (no new clinical recommendations): (1) Belantamab + Pd (TA1133) repositioned with explicit Indication field as a post-Len option after 1 prior lenalidomide-containing line if Len-intolerant or Len-refractory; ocular monitoring warning retained; no longer described as a generic penta-refractory option. (2) D-VRd (GID-TA10726 / ID3843) clarified as "horizon/evidence only" — cited NICE in-development entry currently relates to transplant-unsuitable NDMM; removed from the TE-NDMM commissioned-options list in Section 1 and the TE-NDMM regimen-block area in Section 8; added to the TI-NDMM / horizon area with explicit Pathway placement warning; sidebar NICE Commissioning panel moved D-VRd from "transplant-eligible" to "in development / awaiting"; NDMM algorithm SVG and JPEG updated to show D-VRd as horizon for transplant-unsuitable. (3) Star symbol wording replaced throughout from "currently preferred where eligible" to "recently appraised / commonly pathway-relevant where NICE criteria and local access are met". (4) TA763 wording reworded as "D-VTd induction/consolidation for newly diagnosed transplant-eligible myeloma, within NICE criteria". (5) Algorithm safety footer added to both NDMM and R/R SVGs: "Educational pathway summary only. NICE/Blueteq/local formulary and SmPC verification required before treatment." JPEGs regenerated from updated SVGs. (6) Filenames updated to v0.4.1; banner retained as PROPOSAL ONLY — DRAFT — GOVERNANCE REVIEW with consultant/pharmacy sign-off requirement preserved.</w:t>
+            </w:r>
+          </w:p>
+        </w:tc>
+      </w:tr>
+      <w:tr>
+        <w:trPr>
+          <w:cantSplit/>
+        </w:trPr>
+        <w:tc>
+          <w:tcPr>
+            <w:tcW w:type="dxa" w:w="1200"/>
+            <w:tcBorders>
+              <w:top w:val="single" w:color="D8C9CB" w:sz="4"/>
+              <w:left w:val="single" w:color="D8C9CB" w:sz="4"/>
+              <w:bottom w:val="single" w:color="D8C9CB" w:sz="4"/>
+              <w:right w:val="single" w:color="D8C9CB" w:sz="4"/>
+            </w:tcBorders>
+            <w:tcMar>
+              <w:top w:type="dxa" w:w="80"/>
+              <w:left w:type="dxa" w:w="120"/>
+              <w:bottom w:type="dxa" w:w="80"/>
+              <w:right w:type="dxa" w:w="120"/>
+            </w:tcMar>
+          </w:tcPr>
+          <w:p>
+            <w:r>
+              <w:t>v1.0</w:t>
+            </w:r>
+          </w:p>
+        </w:tc>
+        <w:tc>
+          <w:tcPr>
+            <w:tcW w:type="dxa" w:w="1400"/>
+            <w:tcBorders>
+              <w:top w:val="single" w:color="D8C9CB" w:sz="4"/>
+              <w:left w:val="single" w:color="D8C9CB" w:sz="4"/>
+              <w:bottom w:val="single" w:color="D8C9CB" w:sz="4"/>
+              <w:right w:val="single" w:color="D8C9CB" w:sz="4"/>
+            </w:tcBorders>
+            <w:tcMar>
+              <w:top w:type="dxa" w:w="80"/>
+              <w:left w:type="dxa" w:w="120"/>
+              <w:bottom w:type="dxa" w:w="80"/>
+              <w:right w:type="dxa" w:w="120"/>
+            </w:tcMar>
+          </w:tcPr>
+          <w:p>
+            <w:r>
+              <w:t>26 July 2026</w:t>
+            </w:r>
+          </w:p>
+        </w:tc>
+        <w:tc>
+          <w:tcPr>
+            <w:tcW w:type="dxa" w:w="2400"/>
+            <w:tcBorders>
+              <w:top w:val="single" w:color="D8C9CB" w:sz="4"/>
+              <w:left w:val="single" w:color="D8C9CB" w:sz="4"/>
+              <w:bottom w:val="single" w:color="D8C9CB" w:sz="4"/>
+              <w:right w:val="single" w:color="D8C9CB" w:sz="4"/>
+            </w:tcBorders>
+            <w:tcMar>
+              <w:top w:type="dxa" w:w="80"/>
+              <w:left w:type="dxa" w:w="120"/>
+              <w:bottom w:type="dxa" w:w="80"/>
+              <w:right w:type="dxa" w:w="120"/>
+            </w:tcMar>
+          </w:tcPr>
+          <w:p>
+            <w:r>
+              <w:t>Dr M Mohsin</w:t>
+            </w:r>
+          </w:p>
+        </w:tc>
+        <w:tc>
+          <w:tcPr>
+            <w:tcW w:type="dxa" w:w="4026"/>
+            <w:tcBorders>
+              <w:top w:val="single" w:color="D8C9CB" w:sz="4"/>
+              <w:left w:val="single" w:color="D8C9CB" w:sz="4"/>
+              <w:bottom w:val="single" w:color="D8C9CB" w:sz="4"/>
+              <w:right w:val="single" w:color="D8C9CB" w:sz="4"/>
+            </w:tcBorders>
+            <w:tcMar>
+              <w:top w:type="dxa" w:w="80"/>
+              <w:left w:type="dxa" w:w="120"/>
+              <w:bottom w:type="dxa" w:w="80"/>
+              <w:right w:type="dxa" w:w="120"/>
+            </w:tcMar>
+          </w:tcPr>
+          <w:p>
+            <w:r>
+              <w:t>First published release. Consultant approval and pharmacy verification confirmed by the clinical owner. NICE/appraisal status, Blueteq and formulary controls, dose and adjustment language, supportive-care controls, approved-centre pathways and belantamab ophthalmology pathway confirmed checked. Publication status and metadata updated; clinical recommendations unchanged from v0.4.1.</w:t>
             </w:r>
           </w:p>
         </w:tc>
@@ -28604,6 +28675,10 @@
     <w:sectPr>
       <w:headerReference w:type="default" r:id="rId7"/>
       <w:footerReference w:type="default" r:id="rId8"/>
+      <w:headerReference w:type="first" r:id="rId10"/>
+      <w:headerReference w:type="even" r:id="rId11"/>
+      <w:footerReference w:type="first" r:id="rId12"/>
+      <w:footerReference w:type="even" r:id="rId13"/>
       <w:pgSz w:w="11906" w:h="16838" w:orient="portrait"/>
       <w:pgMar w:top="1440" w:right="1440" w:bottom="1440" w:left="1440" w:header="708" w:footer="708" w:gutter="0"/>
       <w:pgNumType/>
@@ -28715,6 +28790,26 @@
 </w:ftr>
 </file>
 
+<file path=word/footer2.xml><?xml version="1.0" encoding="utf-8"?>
+<w:ftr xmlns:m="http://schemas.openxmlformats.org/officeDocument/2006/math" xmlns:mc="http://schemas.openxmlformats.org/markup-compatibility/2006" xmlns:mo="http://schemas.microsoft.com/office/mac/office/2008/main" xmlns:mv="urn:schemas-microsoft-com:mac:vml" xmlns:o="urn:schemas-microsoft-com:office:office" xmlns:r="http://schemas.openxmlformats.org/officeDocument/2006/relationships" xmlns:v="urn:schemas-microsoft-com:vml" xmlns:w10="urn:schemas-microsoft-com:office:word" xmlns:w14="http://schemas.microsoft.com/office/word/2010/wordml" xmlns:w="http://schemas.openxmlformats.org/wordprocessingml/2006/main" xmlns:wne="http://schemas.microsoft.com/office/word/2006/wordml" xmlns:wp14="http://schemas.microsoft.com/office/word/2010/wordprocessingDrawing" xmlns:wp="http://schemas.openxmlformats.org/drawingml/2006/wordprocessingDrawing" xmlns:wpc="http://schemas.microsoft.com/office/word/2010/wordprocessingCanvas" xmlns:wpg="http://schemas.microsoft.com/office/word/2010/wordprocessingGroup" xmlns:wpi="http://schemas.microsoft.com/office/word/2010/wordprocessingInk" xmlns:wps="http://schemas.microsoft.com/office/word/2010/wordprocessingShape" mc:Ignorable="w14 wp14">
+  <w:p>
+    <w:pPr>
+      <w:pStyle w:val="Footer"/>
+    </w:pPr>
+  </w:p>
+</w:ftr>
+</file>
+
+<file path=word/footer3.xml><?xml version="1.0" encoding="utf-8"?>
+<w:ftr xmlns:m="http://schemas.openxmlformats.org/officeDocument/2006/math" xmlns:mc="http://schemas.openxmlformats.org/markup-compatibility/2006" xmlns:mo="http://schemas.microsoft.com/office/mac/office/2008/main" xmlns:mv="urn:schemas-microsoft-com:mac:vml" xmlns:o="urn:schemas-microsoft-com:office:office" xmlns:r="http://schemas.openxmlformats.org/officeDocument/2006/relationships" xmlns:v="urn:schemas-microsoft-com:vml" xmlns:w10="urn:schemas-microsoft-com:office:word" xmlns:w14="http://schemas.microsoft.com/office/word/2010/wordml" xmlns:w="http://schemas.openxmlformats.org/wordprocessingml/2006/main" xmlns:wne="http://schemas.microsoft.com/office/word/2006/wordml" xmlns:wp14="http://schemas.microsoft.com/office/word/2010/wordprocessingDrawing" xmlns:wp="http://schemas.openxmlformats.org/drawingml/2006/wordprocessingDrawing" xmlns:wpc="http://schemas.microsoft.com/office/word/2010/wordprocessingCanvas" xmlns:wpg="http://schemas.microsoft.com/office/word/2010/wordprocessingGroup" xmlns:wpi="http://schemas.microsoft.com/office/word/2010/wordprocessingInk" xmlns:wps="http://schemas.microsoft.com/office/word/2010/wordprocessingShape" mc:Ignorable="w14 wp14">
+  <w:p>
+    <w:pPr>
+      <w:pStyle w:val="Footer"/>
+    </w:pPr>
+  </w:p>
+</w:ftr>
+</file>
+
 <file path=word/footnotes.xml><?xml version="1.0" encoding="utf-8"?>
 <w:footnotes xmlns:wpc="http://schemas.microsoft.com/office/word/2010/wordprocessingCanvas" xmlns:mc="http://schemas.openxmlformats.org/markup-compatibility/2006" xmlns:o="urn:schemas-microsoft-com:office:office" xmlns:r="http://schemas.openxmlformats.org/officeDocument/2006/relationships" xmlns:m="http://schemas.openxmlformats.org/officeDocument/2006/math" xmlns:v="urn:schemas-microsoft-com:vml" xmlns:wp14="http://schemas.microsoft.com/office/word/2010/wordprocessingDrawing" xmlns:wp="http://schemas.openxmlformats.org/drawingml/2006/wordprocessingDrawing" xmlns:w10="urn:schemas-microsoft-com:office:word" xmlns:w="http://schemas.openxmlformats.org/wordprocessingml/2006/main" xmlns:w14="http://schemas.microsoft.com/office/word/2010/wordml" xmlns:w15="http://schemas.microsoft.com/office/word/2012/wordml" xmlns:wpg="http://schemas.microsoft.com/office/word/2010/wordprocessingGroup" xmlns:wpi="http://schemas.microsoft.com/office/word/2010/wordprocessingInk" xmlns:wne="http://schemas.microsoft.com/office/word/2006/wordml" xmlns:wps="http://schemas.microsoft.com/office/word/2010/wordprocessingShape" mc:Ignorable="w14 w15 wp14">
   <w:footnote w:type="separator" w:id="-1">
@@ -28767,8 +28862,28 @@
         <w:sz w:val="18"/>
         <w:szCs w:val="18"/>
       </w:rPr>
-      <w:t xml:space="preserve">MHA-MYELOMA-2026-v0.4.1-GOVERNANCE-POLISH (DRAFT)</w:t>
+      <w:t>MHA-MYELOMA-2026-v1.0 (PUBLISHED)</w:t>
     </w:r>
+  </w:p>
+</w:hdr>
+</file>
+
+<file path=word/header2.xml><?xml version="1.0" encoding="utf-8"?>
+<w:hdr xmlns:m="http://schemas.openxmlformats.org/officeDocument/2006/math" xmlns:mc="http://schemas.openxmlformats.org/markup-compatibility/2006" xmlns:mo="http://schemas.microsoft.com/office/mac/office/2008/main" xmlns:mv="urn:schemas-microsoft-com:mac:vml" xmlns:o="urn:schemas-microsoft-com:office:office" xmlns:r="http://schemas.openxmlformats.org/officeDocument/2006/relationships" xmlns:v="urn:schemas-microsoft-com:vml" xmlns:w10="urn:schemas-microsoft-com:office:word" xmlns:w14="http://schemas.microsoft.com/office/word/2010/wordml" xmlns:w="http://schemas.openxmlformats.org/wordprocessingml/2006/main" xmlns:wne="http://schemas.microsoft.com/office/word/2006/wordml" xmlns:wp14="http://schemas.microsoft.com/office/word/2010/wordprocessingDrawing" xmlns:wp="http://schemas.openxmlformats.org/drawingml/2006/wordprocessingDrawing" xmlns:wpc="http://schemas.microsoft.com/office/word/2010/wordprocessingCanvas" xmlns:wpg="http://schemas.microsoft.com/office/word/2010/wordprocessingGroup" xmlns:wpi="http://schemas.microsoft.com/office/word/2010/wordprocessingInk" xmlns:wps="http://schemas.microsoft.com/office/word/2010/wordprocessingShape" mc:Ignorable="w14 wp14">
+  <w:p>
+    <w:pPr>
+      <w:pStyle w:val="Header"/>
+    </w:pPr>
+  </w:p>
+</w:hdr>
+</file>
+
+<file path=word/header3.xml><?xml version="1.0" encoding="utf-8"?>
+<w:hdr xmlns:m="http://schemas.openxmlformats.org/officeDocument/2006/math" xmlns:mc="http://schemas.openxmlformats.org/markup-compatibility/2006" xmlns:mo="http://schemas.microsoft.com/office/mac/office/2008/main" xmlns:mv="urn:schemas-microsoft-com:mac:vml" xmlns:o="urn:schemas-microsoft-com:office:office" xmlns:r="http://schemas.openxmlformats.org/officeDocument/2006/relationships" xmlns:v="urn:schemas-microsoft-com:vml" xmlns:w10="urn:schemas-microsoft-com:office:word" xmlns:w14="http://schemas.microsoft.com/office/word/2010/wordml" xmlns:w="http://schemas.openxmlformats.org/wordprocessingml/2006/main" xmlns:wne="http://schemas.microsoft.com/office/word/2006/wordml" xmlns:wp14="http://schemas.microsoft.com/office/word/2010/wordprocessingDrawing" xmlns:wp="http://schemas.openxmlformats.org/drawingml/2006/wordprocessingDrawing" xmlns:wpc="http://schemas.microsoft.com/office/word/2010/wordprocessingCanvas" xmlns:wpg="http://schemas.microsoft.com/office/word/2010/wordprocessingGroup" xmlns:wpi="http://schemas.microsoft.com/office/word/2010/wordprocessingInk" xmlns:wps="http://schemas.microsoft.com/office/word/2010/wordprocessingShape" mc:Ignorable="w14 wp14">
+  <w:p>
+    <w:pPr>
+      <w:pStyle w:val="Header"/>
+    </w:pPr>
   </w:p>
 </w:hdr>
 </file>

</xml_diff>

<commit_message>
feat: publish myeloma guideline v1.0 (#61)
</commit_message>
<xml_diff>
--- a/guidelines/myeloma/guideline.docx
+++ b/guidelines/myeloma/guideline.docx
@@ -82,7 +82,7 @@
           <w:sz w:val="22"/>
           <w:szCs w:val="22"/>
         </w:rPr>
-        <w:t xml:space="preserve">MHA-MYELOMA-2026-v0.4.1-GOVERNANCE-POLISH</w:t>
+        <w:t>MHA-MYELOMA-2026-v1.0</w:t>
       </w:r>
     </w:p>
     <w:p>
@@ -99,7 +99,7 @@
           <w:sz w:val="22"/>
           <w:szCs w:val="22"/>
         </w:rPr>
-        <w:t xml:space="preserve">PROPOSAL ONLY — DRAFT — GOVERNANCE REVIEW</w:t>
+        <w:t>PUBLISHED EDUCATIONAL GUIDELINE — v1.0</w:t>
       </w:r>
     </w:p>
     <w:p>
@@ -116,7 +116,7 @@
           <w:sz w:val="20"/>
           <w:szCs w:val="20"/>
         </w:rPr>
-        <w:t xml:space="preserve">Not for publication, deployment or clinical use without consultant and pharmacy sign-off</w:t>
+        <w:t>Consultant approval and pharmacy verification confirmed by the clinical owner on 26 July 2026</w:t>
       </w:r>
     </w:p>
     <w:p>
@@ -131,7 +131,7 @@
           <w:sz w:val="22"/>
           <w:szCs w:val="22"/>
         </w:rPr>
-        <w:t xml:space="preserve">May 2026</w:t>
+        <w:t xml:space="preserve">26 July 2026</w:t>
       </w:r>
     </w:p>
     <w:p>
@@ -357,7 +357,7 @@
                 <w:sz w:val="20"/>
                 <w:szCs w:val="20"/>
               </w:rPr>
-              <w:t xml:space="preserve">MHA-MYELOMA-2026-v0.4.1-GOVERNANCE-POLISH</w:t>
+              <w:t>MHA-MYELOMA-2026-v1.0</w:t>
             </w:r>
           </w:p>
         </w:tc>
@@ -493,7 +493,7 @@
                 <w:sz w:val="20"/>
                 <w:szCs w:val="20"/>
               </w:rPr>
-              <w:t xml:space="preserve">May 2026 (governance-review draft)</w:t>
+              <w:t>v1.0 — published 26 July 2026</w:t>
             </w:r>
           </w:p>
         </w:tc>
@@ -561,7 +561,7 @@
                 <w:sz w:val="20"/>
                 <w:szCs w:val="20"/>
               </w:rPr>
-              <w:t xml:space="preserve">Before any deployment: consultant and pharmacy sign-off; then May 2027 or sooner on NICE / BSH / UKMS / EHA-EMN update</w:t>
+              <w:t>May 2027 or sooner on NICE / BSH / UKMS / EHA-EMN update</w:t>
             </w:r>
           </w:p>
         </w:tc>
@@ -697,7 +697,7 @@
                 <w:sz w:val="20"/>
                 <w:szCs w:val="20"/>
               </w:rPr>
-              <w:t xml:space="preserve">PROPOSAL ONLY — not for publication, deployment or clinical use without consultant and pharmacy sign-off</w:t>
+              <w:t>PUBLISHED EDUCATIONAL GUIDELINE — consultant approval and pharmacy verification confirmed by the clinical owner on 26 July 2026</w:t>
             </w:r>
           </w:p>
         </w:tc>
@@ -1144,7 +1144,7 @@
                 <w:sz w:val="20"/>
                 <w:szCs w:val="20"/>
               </w:rPr>
-              <w:t xml:space="preserve">v0.4.1 GOVERNANCE POLISH: belantamab + Pd repositioned per TA1133 indication; D-VRd clarified as transplant-unsuitable horizon scanning (GID-TA10726 / ID3843); star symbol wording softened; TA763 reworded ("within NICE criteria"); algorithm safety footers added; May 2026; Dr Muhammad Mohsin.</w:t>
+              <w:t xml:space="preserve">v1.0 PUBLISHED: consultant approval and pharmacy verification confirmed on 26 July 2026; clinical recommendations unchanged from v0.4.1; Dr Muhammad Mohsin, Consultant Haematologist.</w:t>
             </w:r>
           </w:p>
         </w:tc>
@@ -1626,7 +1626,7 @@
           <w:sz w:val="22"/>
           <w:szCs w:val="22"/>
         </w:rPr>
-        <w:t xml:space="preserve">The following NICE-commissioned technology appraisals govern UK clinical practice for myeloma at the time of writing. Selected entries checked May 2026; live NICE verification required before prescribing. TA numbers and commissioning criteria are subject to revision. Several relevant appraisals are in development, in managed-access, or have been terminated, see Section 1A for the active landscape.</w:t>
+        <w:t xml:space="preserve">The following NICE-commissioned technology appraisals govern UK clinical practice for myeloma at the time of writing. Named entries re-verified for publication on 26 July 2026; live NICE verification remains required before prescribing. TA numbers and commissioning criteria are subject to revision. Several relevant appraisals are in development, in managed-access, or have been terminated, see Section 1A for the active landscape.</w:t>
       </w:r>
     </w:p>
     <w:p>
@@ -2271,7 +2271,7 @@
                 <w:sz w:val="22"/>
                 <w:szCs w:val="22"/>
               </w:rPr>
-              <w:t xml:space="preserve">Pomalidomide + dex (TA427), elotuzumab, panobinostat (TA380), isatuximab combinations and several maintenance and earlier-line bispecific or CAR-T regimens have additional or older TAs; verify against the live NICE register before publication. Daratumumab-containing quadruplet regimens for transplant-ineligible NDMM (D-Rd MAIA; D-VMP ALCYONE) do not have a verified TA number in this draft, verify current NICE TA, Blueteq and local formulary status before use rather than presenting these as available.</w:t>
+              <w:t xml:space="preserve">Pomalidomide + dex (TA427), elotuzumab, panobinostat (TA380), isatuximab combinations and several maintenance and earlier-line bispecific or CAR-T regimens have additional or older TAs; verify against the live NICE register before use. Daratumumab-containing quadruplet regimens for transplant-ineligible NDMM (D-Rd MAIA; D-VMP ALCYONE) are not explicitly linked to a verified NICE appraisal in this guideline, verify current NICE TA, Blueteq and local formulary status before use rather than presenting these as available.</w:t>
             </w:r>
           </w:p>
         </w:tc>
@@ -2365,7 +2365,7 @@
                 <w:sz w:val="22"/>
                 <w:szCs w:val="22"/>
               </w:rPr>
-              <w:t xml:space="preserve">This section is horizon scanning only. It must not be used as a prescribing or commissioning statement. NICE appraisal status, Blueteq eligibility, NHS England commissioning, local formulary position and approved-centre access must be verified immediately before treatment decisions. Identifiers and dates listed are derived from NICE pages checked at May 2026; status of any in-development or managed-access entry may change at short notice.</w:t>
+              <w:t xml:space="preserve">This section is horizon scanning only. It must not be used as a prescribing or commissioning statement. NICE appraisal status, Blueteq eligibility, NHS England commissioning, local formulary position and approved-centre access must be verified immediately before treatment decisions. Identifiers and dates were re-verified for publication on 26 July 2026; status of any in-development or managed-access entry may change at short notice.</w:t>
             </w:r>
           </w:p>
         </w:tc>
@@ -2645,7 +2645,7 @@
                 <w:sz w:val="20"/>
                 <w:szCs w:val="20"/>
               </w:rPr>
-              <w:t xml:space="preserve">In development: GID-TA10726 / ID3843. NICE expected publication date 13 May 2026 has passed at the time of this draft; requires live NICE verification.</w:t>
+              <w:t xml:space="preserve">In development: GID-TA10726 / ID3843. The previously listed NICE expected publication date of 13 May 2026 has passed; requires live NICE verification.</w:t>
             </w:r>
           </w:p>
         </w:tc>
@@ -10237,7 +10237,7 @@
           <w:sz w:val="22"/>
           <w:szCs w:val="22"/>
         </w:rPr>
-        <w:t xml:space="preserve">QuiRedex and SWOG E3A06 showed benefit from early lenalidomide-based therapy in high-risk SMM. Treatment of SMM is not NHS standard of care outside trials at the time of this draft.</w:t>
+        <w:t xml:space="preserve">QuiRedex and SWOG E3A06 showed benefit from early lenalidomide-based therapy in high-risk SMM. Treatment of SMM is not NHS standard of care outside trials as at the v1.0 publication review.</w:t>
       </w:r>
     </w:p>
     <w:p>
@@ -13821,7 +13821,7 @@
                 <w:sz w:val="22"/>
                 <w:szCs w:val="22"/>
               </w:rPr>
-              <w:t xml:space="preserve">Daratumumab-containing quadruplet regimens for transplant-ineligible NDMM (D-Rd per MAIA; D-VMP per ALCYONE) do not have a verified TA number in this draft. Verify current NICE TA, Blueteq and local formulary status before use rather than presenting these regimens as available. The NICE-appraised quadruplet for transplant-ineligible NDMM at the time of this draft is Isa-VRd (TA1098, September 2025).</w:t>
+              <w:t xml:space="preserve">Daratumumab-containing quadruplet regimens for transplant-ineligible NDMM (D-Rd per MAIA; D-VMP per ALCYONE) are not explicitly linked to a verified NICE appraisal in this guideline. Verify current NICE TA, Blueteq and local formulary status before use rather than presenting these regimens as available. Isa-VRd is listed under TA1098 for untreated myeloma when stem cell transplant is unsuitable.</w:t>
             </w:r>
           </w:p>
         </w:tc>
@@ -14195,20 +14195,20 @@
           <w:sz w:val="22"/>
           <w:szCs w:val="22"/>
         </w:rPr>
-        <w:t xml:space="preserve">Notes: </w:t>
-      </w:r>
-      <w:r>
-        <w:rPr>
-          <w:rFonts w:ascii="Georgia" w:cs="Georgia" w:eastAsia="Georgia" w:hAnsi="Georgia"/>
-          <w:b w:val="false"/>
-          <w:bCs w:val="false"/>
-          <w:i w:val="false"/>
-          <w:iCs w:val="false"/>
-          <w:color w:val="1D1D1D"/>
-          <w:sz w:val="22"/>
-          <w:szCs w:val="22"/>
-        </w:rPr>
-        <w:t xml:space="preserve">Not routinely commissioned in NHS England at the time of this draft. The v0.3 draft incorrectly cited TA11254; corrected to GID-TA10726 / ID3843 in v0.4 and the indication clarified as transplant-unsuitable in v0.4.1. Do not present as routinely commissioned. See Section 1A NICE Horizon Scanning.</w:t>
+        <w:t xml:space="preserve">Notes: Not presented as routinely commissioned in this guideline.</w:t>
+      </w:r>
+      <w:r>
+        <w:rPr>
+          <w:rFonts w:ascii="Georgia" w:cs="Georgia" w:eastAsia="Georgia" w:hAnsi="Georgia"/>
+          <w:b w:val="false"/>
+          <w:bCs w:val="false"/>
+          <w:i w:val="false"/>
+          <w:iCs w:val="false"/>
+          <w:color w:val="1D1D1D"/>
+          <w:sz w:val="22"/>
+          <w:szCs w:val="22"/>
+        </w:rPr>
+        <w:t xml:space="preserve"> The v0.3 draft incorrectly cited TA11254; corrected to GID-TA10726 / ID3843 in v0.4 and the indication clarified as transplant-unsuitable in v0.4.1. Do not present as routinely commissioned. See Section 1A NICE Horizon Scanning.</w:t>
       </w:r>
     </w:p>
     <w:p>
@@ -17070,20 +17070,20 @@
           <w:sz w:val="22"/>
           <w:szCs w:val="22"/>
         </w:rPr>
-        <w:t xml:space="preserve">Notes: </w:t>
-      </w:r>
-      <w:r>
-        <w:rPr>
-          <w:rFonts w:ascii="Georgia" w:cs="Georgia" w:eastAsia="Georgia" w:hAnsi="Georgia"/>
-          <w:b w:val="false"/>
-          <w:bCs w:val="false"/>
-          <w:i w:val="false"/>
-          <w:iCs w:val="false"/>
-          <w:color w:val="1D1D1D"/>
-          <w:sz w:val="22"/>
-          <w:szCs w:val="22"/>
-        </w:rPr>
-        <w:t xml:space="preserve">NICE TA status to be verified against the live register.</w:t>
+        <w:t xml:space="preserve">Notes: Evidence-only regimen in this guideline; commissioning is not asserted. Confirm current NICE and local access before use.</w:t>
+      </w:r>
+      <w:r>
+        <w:rPr>
+          <w:rFonts w:ascii="Georgia" w:cs="Georgia" w:eastAsia="Georgia" w:hAnsi="Georgia"/>
+          <w:b w:val="false"/>
+          <w:bCs w:val="false"/>
+          <w:i w:val="false"/>
+          <w:iCs w:val="false"/>
+          <w:color w:val="1D1D1D"/>
+          <w:sz w:val="22"/>
+          <w:szCs w:val="22"/>
+        </w:rPr>
+        <w:t xml:space="preserve"/>
       </w:r>
     </w:p>
     <w:p>
@@ -17172,20 +17172,20 @@
           <w:sz w:val="22"/>
           <w:szCs w:val="22"/>
         </w:rPr>
-        <w:t xml:space="preserve">Trial basis: </w:t>
-      </w:r>
-      <w:r>
-        <w:rPr>
-          <w:rFonts w:ascii="Georgia" w:cs="Georgia" w:eastAsia="Georgia" w:hAnsi="Georgia"/>
-          <w:b w:val="false"/>
-          <w:bCs w:val="false"/>
-          <w:i w:val="false"/>
-          <w:iCs w:val="false"/>
-          <w:color w:val="1D1D1D"/>
-          <w:sz w:val="22"/>
-          <w:szCs w:val="22"/>
-        </w:rPr>
-        <w:t xml:space="preserve">ICARIA-MM (Attal et al., Lancet 2019). Improved PFS in lenalidomide-refractory disease.</w:t>
+        <w:t xml:space="preserve">Trial basis: ICARIA-MM (Attal et al., Lancet 2019). Improved PFS in lenalidomide-refractory disease. Evidence-only regimen in this guideline; commissioning is not asserted. Confirm current NICE and local access before use.</w:t>
+      </w:r>
+      <w:r>
+        <w:rPr>
+          <w:rFonts w:ascii="Georgia" w:cs="Georgia" w:eastAsia="Georgia" w:hAnsi="Georgia"/>
+          <w:b w:val="false"/>
+          <w:bCs w:val="false"/>
+          <w:i w:val="false"/>
+          <w:iCs w:val="false"/>
+          <w:color w:val="1D1D1D"/>
+          <w:sz w:val="22"/>
+          <w:szCs w:val="22"/>
+        </w:rPr>
+        <w:t xml:space="preserve"/>
       </w:r>
     </w:p>
     <w:p>
@@ -17978,20 +17978,20 @@
           <w:sz w:val="22"/>
           <w:szCs w:val="22"/>
         </w:rPr>
-        <w:t xml:space="preserve">Notes: </w:t>
-      </w:r>
-      <w:r>
-        <w:rPr>
-          <w:rFonts w:ascii="Georgia" w:cs="Georgia" w:eastAsia="Georgia" w:hAnsi="Georgia"/>
-          <w:b w:val="false"/>
-          <w:bCs w:val="false"/>
-          <w:i w:val="false"/>
-          <w:iCs w:val="false"/>
-          <w:color w:val="1D1D1D"/>
-          <w:sz w:val="22"/>
-          <w:szCs w:val="22"/>
-        </w:rPr>
-        <w:t xml:space="preserve">No current NICE TA at the time of this draft. Not routinely commissioned. Access via trial or named-patient programme only.</w:t>
+        <w:t xml:space="preserve">Notes: No NICE TA was identified at publication review on 26 July 2026.</w:t>
+      </w:r>
+      <w:r>
+        <w:rPr>
+          <w:rFonts w:ascii="Georgia" w:cs="Georgia" w:eastAsia="Georgia" w:hAnsi="Georgia"/>
+          <w:b w:val="false"/>
+          <w:bCs w:val="false"/>
+          <w:i w:val="false"/>
+          <w:iCs w:val="false"/>
+          <w:color w:val="1D1D1D"/>
+          <w:sz w:val="22"/>
+          <w:szCs w:val="22"/>
+        </w:rPr>
+        <w:t xml:space="preserve"> Not routinely commissioned. Access via trial or named-patient programme only.</w:t>
       </w:r>
     </w:p>
     <w:p>
@@ -18221,7 +18221,7 @@
           <w:sz w:val="20"/>
           <w:szCs w:val="20"/>
         </w:rPr>
-        <w:t xml:space="preserve">NICE TA status to verify</w:t>
+        <w:t xml:space="preserve">Evidence only — commissioning not asserted</w:t>
       </w:r>
       <w:r>
         <w:rPr>
@@ -18298,20 +18298,20 @@
           <w:sz w:val="22"/>
           <w:szCs w:val="22"/>
         </w:rPr>
-        <w:t xml:space="preserve">Notes: </w:t>
-      </w:r>
-      <w:r>
-        <w:rPr>
-          <w:rFonts w:ascii="Georgia" w:cs="Georgia" w:eastAsia="Georgia" w:hAnsi="Georgia"/>
-          <w:b w:val="false"/>
-          <w:bCs w:val="false"/>
-          <w:i w:val="false"/>
-          <w:iCs w:val="false"/>
-          <w:color w:val="1D1D1D"/>
-          <w:sz w:val="22"/>
-          <w:szCs w:val="22"/>
-        </w:rPr>
-        <w:t xml:space="preserve">One-off autologous BCMA CAR-T. Treatment in approved centres only. Bridging therapy commonly required. Cytokine release syndrome, ICANS, prolonged cytopenias and hypogammaglobulinaemia routine. Verify current NICE TA and NHS England specialised commissioning before referral.</w:t>
+        <w:t xml:space="preserve">Notes: One-off autologous BCMA CAR-T, included for evidence context only and not presented here as a routine NICE-commissioned option. Treatment in approved centres only. Bridging therapy commonly required. Cytokine release syndrome, ICANS, prolonged cytopenias and hypogammaglobulinaemia routine. Confirm the current NICE and NHS England specialised-commissioning position before referral.</w:t>
+      </w:r>
+      <w:r>
+        <w:rPr>
+          <w:rFonts w:ascii="Georgia" w:cs="Georgia" w:eastAsia="Georgia" w:hAnsi="Georgia"/>
+          <w:b w:val="false"/>
+          <w:bCs w:val="false"/>
+          <w:i w:val="false"/>
+          <w:iCs w:val="false"/>
+          <w:color w:val="1D1D1D"/>
+          <w:sz w:val="22"/>
+          <w:szCs w:val="22"/>
+        </w:rPr>
+        <w:t xml:space="preserve"/>
       </w:r>
     </w:p>
     <w:p>
@@ -18439,7 +18439,7 @@
           <w:sz w:val="22"/>
           <w:szCs w:val="22"/>
         </w:rPr>
-        <w:t xml:space="preserve">TA889 was terminated after Janssen withdrew its submission — no NICE recommendation for routine commissioning under that appraisal. A separate NICE appraisal (GID-TA10905 / ID4012) for cilta-cel in relapsed and lenalidomide-refractory myeloma after 1 to 3 prior therapies is in development, with appraisal scheduled to begin early July 2026 per the NICE timeline. These are two distinct appraisals and must not be conflated. Access in UK routine commissioning currently absent; specialist-centre decision and individual funding only. Approved-centre pathway and live NICE verification required before referral.</w:t>
+        <w:t xml:space="preserve">TA889 was terminated after Janssen withdrew its submission — no NICE recommendation for routine commissioning under that appraisal. A separate NICE appraisal (GID-TA10905 / ID4012) for cilta-cel in relapsed and lenalidomide-refractory myeloma after 1 to 3 prior therapies is in development, which remained in development at publication review on 26 July 2026. These are two distinct appraisals and must not be conflated. Access in UK routine commissioning is not established; approved-centre referral only if final NICE guidance supports use.</w:t>
       </w:r>
     </w:p>
     <w:p>
@@ -24261,7 +24261,7 @@
           <w:sz w:val="24"/>
           <w:szCs w:val="24"/>
         </w:rPr>
-        <w:t xml:space="preserve">Pre-publication governance checklist (must be cleared before live deployment)</w:t>
+        <w:t xml:space="preserve">Publication governance checklist (completed 26 July 2026)</w:t>
       </w:r>
     </w:p>
     <w:p>
@@ -24284,7 +24284,7 @@
           <w:sz w:val="22"/>
           <w:szCs w:val="22"/>
         </w:rPr>
-        <w:t xml:space="preserve">Live NICE TA verification completed for every named regimen.</w:t>
+        <w:t xml:space="preserve">Live NICE TA verification completed for every regimen presented as NICE-recommended or managed access. Evidence-only regimens do not assert commissioning.</w:t>
       </w:r>
     </w:p>
     <w:p>
@@ -24606,7 +24606,7 @@
           <w:sz w:val="22"/>
           <w:szCs w:val="22"/>
         </w:rPr>
-        <w:t xml:space="preserve">The draft label removed only after consultant review, pharmacy review, NICE TA re-verification and approved-centre confirmation are complete.</w:t>
+        <w:t xml:space="preserve">Release decision: consultant approval and pharmacy verification confirmed by the clinical owner on 26 July 2026. The pharmacist's identity is not recorded in this public document. NICE TA, Blueteq, formulary, dose, approved-centre and ophthalmology pathway checks were confirmed complete for publication.</w:t>
       </w:r>
     </w:p>
     <w:p>
@@ -24668,7 +24668,7 @@
           <w:sz w:val="22"/>
           <w:szCs w:val="22"/>
         </w:rPr>
-        <w:t xml:space="preserve">NICE TA entries cited here reflect selected checks at May 2026; live NICE register verification is required before any prescribing decision and before each review cycle.</w:t>
+        <w:t xml:space="preserve">NICE TA and appraisal statuses were re-verified for publication on 26 July 2026; live NICE register verification remains required before any prescribing decision and before each review cycle.</w:t>
       </w:r>
     </w:p>
     <w:p>
@@ -24760,7 +24760,7 @@
           <w:sz w:val="22"/>
           <w:szCs w:val="22"/>
         </w:rPr>
-        <w:t xml:space="preserve">Cilta-cel access in routine commissioning remains absent (TA889 terminated); the in-development earlier-line appraisal (GID-TA10905 / ID4012) is scheduled to begin in early July 2026.</w:t>
+        <w:t xml:space="preserve">Cilta-cel access in routine commissioning is not established under terminated TA889; the separate earlier-line appraisal GID-TA10905 / ID4012 remained in development at publication review on 26 July 2026.</w:t>
       </w:r>
     </w:p>
     <w:p>
@@ -26862,7 +26862,7 @@
           <w:sz w:val="24"/>
           <w:szCs w:val="24"/>
         </w:rPr>
-        <w:t xml:space="preserve">NICE technology appraisals — selected entries checked May 2026; live NICE verification required before prescribing</w:t>
+        <w:t xml:space="preserve">NICE technology appraisals — statuses re-verified for publication on 26 July 2026; live NICE verification remains required before prescribing</w:t>
       </w:r>
     </w:p>
     <w:p>
@@ -27896,19 +27896,8 @@
             </w:tcMar>
           </w:tcPr>
           <w:p>
-            <w:pPr>
-              <w:spacing w:after="0" w:before="0" w:line="260"/>
-            </w:pPr>
-            <w:r>
-              <w:rPr>
-                <w:rFonts w:ascii="Georgia" w:cs="Georgia" w:eastAsia="Georgia" w:hAnsi="Georgia"/>
-                <w:b w:val="false"/>
-                <w:bCs w:val="false"/>
-                <w:color w:val="1D1D1D"/>
-                <w:sz w:val="20"/>
-                <w:szCs w:val="20"/>
-              </w:rPr>
-              <w:t xml:space="preserve">May 2026</w:t>
+            <w:r>
+              <w:t>May 2026</w:t>
             </w:r>
           </w:p>
         </w:tc>
@@ -28498,19 +28487,101 @@
             </w:tcMar>
           </w:tcPr>
           <w:p>
-            <w:pPr>
-              <w:spacing w:after="0" w:before="0" w:line="260"/>
-            </w:pPr>
-            <w:r>
-              <w:rPr>
-                <w:rFonts w:ascii="Georgia" w:cs="Georgia" w:eastAsia="Georgia" w:hAnsi="Georgia"/>
-                <w:b w:val="false"/>
-                <w:bCs w:val="false"/>
-                <w:color w:val="1D1D1D"/>
-                <w:sz w:val="20"/>
-                <w:szCs w:val="20"/>
-              </w:rPr>
-              <w:t xml:space="preserve">Minimal safety polish (no new clinical recommendations): (1) Belantamab + Pd (TA1133) repositioned with explicit Indication field as a post-Len option after 1 prior lenalidomide-containing line if Len-intolerant or Len-refractory; ocular monitoring warning retained; no longer described as a generic penta-refractory option. (2) D-VRd (GID-TA10726 / ID3843) clarified as "horizon/evidence only" — cited NICE in-development entry currently relates to transplant-unsuitable NDMM; removed from the TE-NDMM commissioned-options list in Section 1 and the TE-NDMM regimen-block area in Section 8; added to the TI-NDMM / horizon area with explicit Pathway placement warning; sidebar NICE Commissioning panel moved D-VRd from "transplant-eligible" to "in development / awaiting"; NDMM algorithm SVG and JPEG updated to show D-VRd as horizon for transplant-unsuitable. (3) Star symbol wording replaced throughout from "currently preferred where eligible" to "recently appraised / commonly pathway-relevant where NICE criteria and local access are met". (4) TA763 wording reworded as "D-VTd induction/consolidation for newly diagnosed transplant-eligible myeloma, within NICE criteria". (5) Algorithm safety footer added to both NDMM and R/R SVGs: "Educational pathway summary only. NICE/Blueteq/local formulary and SmPC verification required before treatment." JPEGs regenerated from updated SVGs. (6) Filenames updated to v0.4.1; banner retained as PROPOSAL ONLY — DRAFT — GOVERNANCE REVIEW with consultant/pharmacy sign-off requirement preserved.</w:t>
+            <w:r>
+              <w:t>Minimal safety polish (no new clinical recommendations): (1) Belantamab + Pd (TA1133) repositioned with explicit Indication field as a post-Len option after 1 prior lenalidomide-containing line if Len-intolerant or Len-refractory; ocular monitoring warning retained; no longer described as a generic penta-refractory option. (2) D-VRd (GID-TA10726 / ID3843) clarified as "horizon/evidence only" — cited NICE in-development entry currently relates to transplant-unsuitable NDMM; removed from the TE-NDMM commissioned-options list in Section 1 and the TE-NDMM regimen-block area in Section 8; added to the TI-NDMM / horizon area with explicit Pathway placement warning; sidebar NICE Commissioning panel moved D-VRd from "transplant-eligible" to "in development / awaiting"; NDMM algorithm SVG and JPEG updated to show D-VRd as horizon for transplant-unsuitable. (3) Star symbol wording replaced throughout from "currently preferred where eligible" to "recently appraised / commonly pathway-relevant where NICE criteria and local access are met". (4) TA763 wording reworded as "D-VTd induction/consolidation for newly diagnosed transplant-eligible myeloma, within NICE criteria". (5) Algorithm safety footer added to both NDMM and R/R SVGs: "Educational pathway summary only. NICE/Blueteq/local formulary and SmPC verification required before treatment." JPEGs regenerated from updated SVGs. (6) Filenames updated to v0.4.1; banner retained as PROPOSAL ONLY — DRAFT — GOVERNANCE REVIEW with consultant/pharmacy sign-off requirement preserved.</w:t>
+            </w:r>
+          </w:p>
+        </w:tc>
+      </w:tr>
+      <w:tr>
+        <w:trPr>
+          <w:cantSplit/>
+        </w:trPr>
+        <w:tc>
+          <w:tcPr>
+            <w:tcW w:type="dxa" w:w="1200"/>
+            <w:tcBorders>
+              <w:top w:val="single" w:color="D8C9CB" w:sz="4"/>
+              <w:left w:val="single" w:color="D8C9CB" w:sz="4"/>
+              <w:bottom w:val="single" w:color="D8C9CB" w:sz="4"/>
+              <w:right w:val="single" w:color="D8C9CB" w:sz="4"/>
+            </w:tcBorders>
+            <w:tcMar>
+              <w:top w:type="dxa" w:w="80"/>
+              <w:left w:type="dxa" w:w="120"/>
+              <w:bottom w:type="dxa" w:w="80"/>
+              <w:right w:type="dxa" w:w="120"/>
+            </w:tcMar>
+          </w:tcPr>
+          <w:p>
+            <w:r>
+              <w:t>v1.0</w:t>
+            </w:r>
+          </w:p>
+        </w:tc>
+        <w:tc>
+          <w:tcPr>
+            <w:tcW w:type="dxa" w:w="1400"/>
+            <w:tcBorders>
+              <w:top w:val="single" w:color="D8C9CB" w:sz="4"/>
+              <w:left w:val="single" w:color="D8C9CB" w:sz="4"/>
+              <w:bottom w:val="single" w:color="D8C9CB" w:sz="4"/>
+              <w:right w:val="single" w:color="D8C9CB" w:sz="4"/>
+            </w:tcBorders>
+            <w:tcMar>
+              <w:top w:type="dxa" w:w="80"/>
+              <w:left w:type="dxa" w:w="120"/>
+              <w:bottom w:type="dxa" w:w="80"/>
+              <w:right w:type="dxa" w:w="120"/>
+            </w:tcMar>
+          </w:tcPr>
+          <w:p>
+            <w:r>
+              <w:t>26 July 2026</w:t>
+            </w:r>
+          </w:p>
+        </w:tc>
+        <w:tc>
+          <w:tcPr>
+            <w:tcW w:type="dxa" w:w="2400"/>
+            <w:tcBorders>
+              <w:top w:val="single" w:color="D8C9CB" w:sz="4"/>
+              <w:left w:val="single" w:color="D8C9CB" w:sz="4"/>
+              <w:bottom w:val="single" w:color="D8C9CB" w:sz="4"/>
+              <w:right w:val="single" w:color="D8C9CB" w:sz="4"/>
+            </w:tcBorders>
+            <w:tcMar>
+              <w:top w:type="dxa" w:w="80"/>
+              <w:left w:type="dxa" w:w="120"/>
+              <w:bottom w:type="dxa" w:w="80"/>
+              <w:right w:type="dxa" w:w="120"/>
+            </w:tcMar>
+          </w:tcPr>
+          <w:p>
+            <w:r>
+              <w:t>Dr M Mohsin</w:t>
+            </w:r>
+          </w:p>
+        </w:tc>
+        <w:tc>
+          <w:tcPr>
+            <w:tcW w:type="dxa" w:w="4026"/>
+            <w:tcBorders>
+              <w:top w:val="single" w:color="D8C9CB" w:sz="4"/>
+              <w:left w:val="single" w:color="D8C9CB" w:sz="4"/>
+              <w:bottom w:val="single" w:color="D8C9CB" w:sz="4"/>
+              <w:right w:val="single" w:color="D8C9CB" w:sz="4"/>
+            </w:tcBorders>
+            <w:tcMar>
+              <w:top w:type="dxa" w:w="80"/>
+              <w:left w:type="dxa" w:w="120"/>
+              <w:bottom w:type="dxa" w:w="80"/>
+              <w:right w:type="dxa" w:w="120"/>
+            </w:tcMar>
+          </w:tcPr>
+          <w:p>
+            <w:r>
+              <w:t>First published release. Consultant approval and pharmacy verification confirmed by the clinical owner. NICE/appraisal status, Blueteq and formulary controls, dose and adjustment language, supportive-care controls, approved-centre pathways and belantamab ophthalmology pathway confirmed checked. Publication status and metadata updated; clinical recommendations unchanged from v0.4.1.</w:t>
             </w:r>
           </w:p>
         </w:tc>
@@ -28604,6 +28675,10 @@
     <w:sectPr>
       <w:headerReference w:type="default" r:id="rId7"/>
       <w:footerReference w:type="default" r:id="rId8"/>
+      <w:headerReference w:type="first" r:id="rId10"/>
+      <w:headerReference w:type="even" r:id="rId11"/>
+      <w:footerReference w:type="first" r:id="rId12"/>
+      <w:footerReference w:type="even" r:id="rId13"/>
       <w:pgSz w:w="11906" w:h="16838" w:orient="portrait"/>
       <w:pgMar w:top="1440" w:right="1440" w:bottom="1440" w:left="1440" w:header="708" w:footer="708" w:gutter="0"/>
       <w:pgNumType/>
@@ -28715,6 +28790,26 @@
 </w:ftr>
 </file>
 
+<file path=word/footer2.xml><?xml version="1.0" encoding="utf-8"?>
+<w:ftr xmlns:m="http://schemas.openxmlformats.org/officeDocument/2006/math" xmlns:mc="http://schemas.openxmlformats.org/markup-compatibility/2006" xmlns:mo="http://schemas.microsoft.com/office/mac/office/2008/main" xmlns:mv="urn:schemas-microsoft-com:mac:vml" xmlns:o="urn:schemas-microsoft-com:office:office" xmlns:r="http://schemas.openxmlformats.org/officeDocument/2006/relationships" xmlns:v="urn:schemas-microsoft-com:vml" xmlns:w10="urn:schemas-microsoft-com:office:word" xmlns:w14="http://schemas.microsoft.com/office/word/2010/wordml" xmlns:w="http://schemas.openxmlformats.org/wordprocessingml/2006/main" xmlns:wne="http://schemas.microsoft.com/office/word/2006/wordml" xmlns:wp14="http://schemas.microsoft.com/office/word/2010/wordprocessingDrawing" xmlns:wp="http://schemas.openxmlformats.org/drawingml/2006/wordprocessingDrawing" xmlns:wpc="http://schemas.microsoft.com/office/word/2010/wordprocessingCanvas" xmlns:wpg="http://schemas.microsoft.com/office/word/2010/wordprocessingGroup" xmlns:wpi="http://schemas.microsoft.com/office/word/2010/wordprocessingInk" xmlns:wps="http://schemas.microsoft.com/office/word/2010/wordprocessingShape" mc:Ignorable="w14 wp14">
+  <w:p>
+    <w:pPr>
+      <w:pStyle w:val="Footer"/>
+    </w:pPr>
+  </w:p>
+</w:ftr>
+</file>
+
+<file path=word/footer3.xml><?xml version="1.0" encoding="utf-8"?>
+<w:ftr xmlns:m="http://schemas.openxmlformats.org/officeDocument/2006/math" xmlns:mc="http://schemas.openxmlformats.org/markup-compatibility/2006" xmlns:mo="http://schemas.microsoft.com/office/mac/office/2008/main" xmlns:mv="urn:schemas-microsoft-com:mac:vml" xmlns:o="urn:schemas-microsoft-com:office:office" xmlns:r="http://schemas.openxmlformats.org/officeDocument/2006/relationships" xmlns:v="urn:schemas-microsoft-com:vml" xmlns:w10="urn:schemas-microsoft-com:office:word" xmlns:w14="http://schemas.microsoft.com/office/word/2010/wordml" xmlns:w="http://schemas.openxmlformats.org/wordprocessingml/2006/main" xmlns:wne="http://schemas.microsoft.com/office/word/2006/wordml" xmlns:wp14="http://schemas.microsoft.com/office/word/2010/wordprocessingDrawing" xmlns:wp="http://schemas.openxmlformats.org/drawingml/2006/wordprocessingDrawing" xmlns:wpc="http://schemas.microsoft.com/office/word/2010/wordprocessingCanvas" xmlns:wpg="http://schemas.microsoft.com/office/word/2010/wordprocessingGroup" xmlns:wpi="http://schemas.microsoft.com/office/word/2010/wordprocessingInk" xmlns:wps="http://schemas.microsoft.com/office/word/2010/wordprocessingShape" mc:Ignorable="w14 wp14">
+  <w:p>
+    <w:pPr>
+      <w:pStyle w:val="Footer"/>
+    </w:pPr>
+  </w:p>
+</w:ftr>
+</file>
+
 <file path=word/footnotes.xml><?xml version="1.0" encoding="utf-8"?>
 <w:footnotes xmlns:wpc="http://schemas.microsoft.com/office/word/2010/wordprocessingCanvas" xmlns:mc="http://schemas.openxmlformats.org/markup-compatibility/2006" xmlns:o="urn:schemas-microsoft-com:office:office" xmlns:r="http://schemas.openxmlformats.org/officeDocument/2006/relationships" xmlns:m="http://schemas.openxmlformats.org/officeDocument/2006/math" xmlns:v="urn:schemas-microsoft-com:vml" xmlns:wp14="http://schemas.microsoft.com/office/word/2010/wordprocessingDrawing" xmlns:wp="http://schemas.openxmlformats.org/drawingml/2006/wordprocessingDrawing" xmlns:w10="urn:schemas-microsoft-com:office:word" xmlns:w="http://schemas.openxmlformats.org/wordprocessingml/2006/main" xmlns:w14="http://schemas.microsoft.com/office/word/2010/wordml" xmlns:w15="http://schemas.microsoft.com/office/word/2012/wordml" xmlns:wpg="http://schemas.microsoft.com/office/word/2010/wordprocessingGroup" xmlns:wpi="http://schemas.microsoft.com/office/word/2010/wordprocessingInk" xmlns:wne="http://schemas.microsoft.com/office/word/2006/wordml" xmlns:wps="http://schemas.microsoft.com/office/word/2010/wordprocessingShape" mc:Ignorable="w14 w15 wp14">
   <w:footnote w:type="separator" w:id="-1">
@@ -28767,8 +28862,28 @@
         <w:sz w:val="18"/>
         <w:szCs w:val="18"/>
       </w:rPr>
-      <w:t xml:space="preserve">MHA-MYELOMA-2026-v0.4.1-GOVERNANCE-POLISH (DRAFT)</w:t>
+      <w:t>MHA-MYELOMA-2026-v1.0 (PUBLISHED)</w:t>
     </w:r>
+  </w:p>
+</w:hdr>
+</file>
+
+<file path=word/header2.xml><?xml version="1.0" encoding="utf-8"?>
+<w:hdr xmlns:m="http://schemas.openxmlformats.org/officeDocument/2006/math" xmlns:mc="http://schemas.openxmlformats.org/markup-compatibility/2006" xmlns:mo="http://schemas.microsoft.com/office/mac/office/2008/main" xmlns:mv="urn:schemas-microsoft-com:mac:vml" xmlns:o="urn:schemas-microsoft-com:office:office" xmlns:r="http://schemas.openxmlformats.org/officeDocument/2006/relationships" xmlns:v="urn:schemas-microsoft-com:vml" xmlns:w10="urn:schemas-microsoft-com:office:word" xmlns:w14="http://schemas.microsoft.com/office/word/2010/wordml" xmlns:w="http://schemas.openxmlformats.org/wordprocessingml/2006/main" xmlns:wne="http://schemas.microsoft.com/office/word/2006/wordml" xmlns:wp14="http://schemas.microsoft.com/office/word/2010/wordprocessingDrawing" xmlns:wp="http://schemas.openxmlformats.org/drawingml/2006/wordprocessingDrawing" xmlns:wpc="http://schemas.microsoft.com/office/word/2010/wordprocessingCanvas" xmlns:wpg="http://schemas.microsoft.com/office/word/2010/wordprocessingGroup" xmlns:wpi="http://schemas.microsoft.com/office/word/2010/wordprocessingInk" xmlns:wps="http://schemas.microsoft.com/office/word/2010/wordprocessingShape" mc:Ignorable="w14 wp14">
+  <w:p>
+    <w:pPr>
+      <w:pStyle w:val="Header"/>
+    </w:pPr>
+  </w:p>
+</w:hdr>
+</file>
+
+<file path=word/header3.xml><?xml version="1.0" encoding="utf-8"?>
+<w:hdr xmlns:m="http://schemas.openxmlformats.org/officeDocument/2006/math" xmlns:mc="http://schemas.openxmlformats.org/markup-compatibility/2006" xmlns:mo="http://schemas.microsoft.com/office/mac/office/2008/main" xmlns:mv="urn:schemas-microsoft-com:mac:vml" xmlns:o="urn:schemas-microsoft-com:office:office" xmlns:r="http://schemas.openxmlformats.org/officeDocument/2006/relationships" xmlns:v="urn:schemas-microsoft-com:vml" xmlns:w10="urn:schemas-microsoft-com:office:word" xmlns:w14="http://schemas.microsoft.com/office/word/2010/wordml" xmlns:w="http://schemas.openxmlformats.org/wordprocessingml/2006/main" xmlns:wne="http://schemas.microsoft.com/office/word/2006/wordml" xmlns:wp14="http://schemas.microsoft.com/office/word/2010/wordprocessingDrawing" xmlns:wp="http://schemas.openxmlformats.org/drawingml/2006/wordprocessingDrawing" xmlns:wpc="http://schemas.microsoft.com/office/word/2010/wordprocessingCanvas" xmlns:wpg="http://schemas.microsoft.com/office/word/2010/wordprocessingGroup" xmlns:wpi="http://schemas.microsoft.com/office/word/2010/wordprocessingInk" xmlns:wps="http://schemas.microsoft.com/office/word/2010/wordprocessingShape" mc:Ignorable="w14 wp14">
+  <w:p>
+    <w:pPr>
+      <w:pStyle w:val="Header"/>
+    </w:pPr>
   </w:p>
 </w:hdr>
 </file>

</xml_diff>

<commit_message>
feat: publish myeloma v1.1 pathway update
</commit_message>
<xml_diff>
--- a/guidelines/myeloma/guideline.docx
+++ b/guidelines/myeloma/guideline.docx
@@ -74,15 +74,7 @@
         <w:jc w:val="center"/>
       </w:pPr>
       <w:r>
-        <w:rPr>
-          <w:rFonts w:ascii="Georgia" w:cs="Georgia" w:eastAsia="Georgia" w:hAnsi="Georgia"/>
-          <w:b/>
-          <w:bCs/>
-          <w:color w:val="7A1F2B"/>
-          <w:sz w:val="22"/>
-          <w:szCs w:val="22"/>
-        </w:rPr>
-        <w:t>MHA-MYELOMA-2026-v1.0</w:t>
+        <w:t>MHA-MYELOMA-2026-v1.1</w:t>
       </w:r>
     </w:p>
     <w:p>
@@ -91,15 +83,7 @@
         <w:jc w:val="center"/>
       </w:pPr>
       <w:r>
-        <w:rPr>
-          <w:rFonts w:ascii="Georgia" w:cs="Georgia" w:eastAsia="Georgia" w:hAnsi="Georgia"/>
-          <w:b/>
-          <w:bCs/>
-          <w:color w:val="C87A00"/>
-          <w:sz w:val="22"/>
-          <w:szCs w:val="22"/>
-        </w:rPr>
-        <w:t>PUBLISHED EDUCATIONAL GUIDELINE — v1.0</w:t>
+        <w:t>PUBLISHED EDUCATIONAL GUIDELINE — v1.1</w:t>
       </w:r>
     </w:p>
     <w:p>
@@ -108,15 +92,7 @@
         <w:jc w:val="center"/>
       </w:pPr>
       <w:r>
-        <w:rPr>
-          <w:rFonts w:ascii="Georgia" w:cs="Georgia" w:eastAsia="Georgia" w:hAnsi="Georgia"/>
-          <w:i/>
-          <w:iCs/>
-          <w:color w:val="4A4A4A"/>
-          <w:sz w:val="20"/>
-          <w:szCs w:val="20"/>
-        </w:rPr>
-        <w:t>Consultant approval and pharmacy verification confirmed by the clinical owner on 26 July 2026</w:t>
+        <w:t>Clinical owner approval and pharmacy verification confirmed on 26 July 2026; pharmacist name retained privately</w:t>
       </w:r>
     </w:p>
     <w:p>
@@ -349,15 +325,7 @@
               <w:spacing w:after="0" w:before="0" w:line="260"/>
             </w:pPr>
             <w:r>
-              <w:rPr>
-                <w:rFonts w:ascii="Georgia" w:cs="Georgia" w:eastAsia="Georgia" w:hAnsi="Georgia"/>
-                <w:b w:val="false"/>
-                <w:bCs w:val="false"/>
-                <w:color w:val="1D1D1D"/>
-                <w:sz w:val="20"/>
-                <w:szCs w:val="20"/>
-              </w:rPr>
-              <w:t>MHA-MYELOMA-2026-v1.0</w:t>
+              <w:t>MHA-MYELOMA-2026-v1.1</w:t>
             </w:r>
           </w:p>
         </w:tc>
@@ -485,15 +453,7 @@
               <w:spacing w:after="0" w:before="0" w:line="260"/>
             </w:pPr>
             <w:r>
-              <w:rPr>
-                <w:rFonts w:ascii="Georgia" w:cs="Georgia" w:eastAsia="Georgia" w:hAnsi="Georgia"/>
-                <w:b w:val="false"/>
-                <w:bCs w:val="false"/>
-                <w:color w:val="1D1D1D"/>
-                <w:sz w:val="20"/>
-                <w:szCs w:val="20"/>
-              </w:rPr>
-              <w:t>v1.0 — published 26 July 2026</w:t>
+              <w:t>v1.1 — published 26 July 2026</w:t>
             </w:r>
           </w:p>
         </w:tc>
@@ -689,15 +649,7 @@
               <w:spacing w:after="0" w:before="0" w:line="260"/>
             </w:pPr>
             <w:r>
-              <w:rPr>
-                <w:rFonts w:ascii="Georgia" w:cs="Georgia" w:eastAsia="Georgia" w:hAnsi="Georgia"/>
-                <w:b w:val="false"/>
-                <w:bCs w:val="false"/>
-                <w:color w:val="1D1D1D"/>
-                <w:sz w:val="20"/>
-                <w:szCs w:val="20"/>
-              </w:rPr>
-              <w:t>PUBLISHED EDUCATIONAL GUIDELINE — consultant approval and pharmacy verification confirmed by the clinical owner on 26 July 2026</w:t>
+              <w:t>PUBLISHED EDUCATIONAL GUIDELINE — v1.1. Clinical owner approval and pharmacy verification confirmed on 26 July 2026; the pharmacist's name remains private.</w:t>
             </w:r>
           </w:p>
         </w:tc>
@@ -1136,15 +1088,7 @@
               <w:spacing w:after="0" w:before="0" w:line="260"/>
             </w:pPr>
             <w:r>
-              <w:rPr>
-                <w:rFonts w:ascii="Georgia" w:cs="Georgia" w:eastAsia="Georgia" w:hAnsi="Georgia"/>
-                <w:b w:val="false"/>
-                <w:bCs w:val="false"/>
-                <w:color w:val="1D1D1D"/>
-                <w:sz w:val="20"/>
-                <w:szCs w:val="20"/>
-              </w:rPr>
-              <w:t xml:space="preserve">v1.0 PUBLISHED: consultant approval and pharmacy verification confirmed on 26 July 2026; clinical recommendations unchanged from v0.4.1; Dr Muhammad Mohsin, Consultant Haematologist.</w:t>
+              <w:t>v1.1 PUBLISHED: D-VRd updated to TA1170 for ASCT-unsuitable untreated myeloma; GID-TA11254 / ID6249 recorded as in development for ASCT-suitable untreated myeloma. Clinical owner approval and pharmacy verification confirmed on 26 July 2026.</w:t>
             </w:r>
           </w:p>
         </w:tc>
@@ -1389,30 +1333,7 @@
         <w:spacing w:after="40" w:before="40" w:line="280"/>
       </w:pPr>
       <w:r>
-        <w:rPr>
-          <w:rFonts w:ascii="Georgia" w:cs="Georgia" w:eastAsia="Georgia" w:hAnsi="Georgia"/>
-          <w:b/>
-          <w:bCs/>
-          <w:i w:val="false"/>
-          <w:iCs w:val="false"/>
-          <w:color w:val="7A1F2B"/>
-          <w:sz w:val="22"/>
-          <w:szCs w:val="22"/>
-        </w:rPr>
-        <w:t xml:space="preserve">NDMM transplant-eligible (standard risk): </w:t>
-      </w:r>
-      <w:r>
-        <w:rPr>
-          <w:rFonts w:ascii="Georgia" w:cs="Georgia" w:eastAsia="Georgia" w:hAnsi="Georgia"/>
-          <w:b w:val="false"/>
-          <w:bCs w:val="false"/>
-          <w:i w:val="false"/>
-          <w:iCs w:val="false"/>
-          <w:color w:val="1D1D1D"/>
-          <w:sz w:val="22"/>
-          <w:szCs w:val="22"/>
-        </w:rPr>
-        <w:t xml:space="preserve">daratumumab-containing quadruplet induction per current NICE technology appraisal (currently D-VTd per TA763, within NICE criteria), plus single ASCT, plus lenalidomide maintenance until progression (TA680). D-VRd (PERSEUS-based, GID-TA10726 / ID3843) is in development for transplant-unsuitable NDMM and is not a commissioned TE-NDMM option.</w:t>
+        <w:t>NDMM transplant-eligible (standard risk): daratumumab-containing quadruplet induction per current NICE technology appraisal (currently D-VTd per TA763, within NICE criteria), plus single ASCT, plus lenalidomide maintenance until progression (TA680). D-VRd (PERSEUS-based) is under separate NICE appraisal for transplant-eligible NDMM (GID-TA11254 / ID6249, in development; expected publication TBC) and is not yet a commissioned TE-NDMM option.</w:t>
       </w:r>
     </w:p>
     <w:p>
@@ -1616,17 +1537,7 @@
         <w:jc w:val="left"/>
       </w:pPr>
       <w:r>
-        <w:rPr>
-          <w:rFonts w:ascii="Georgia" w:cs="Georgia" w:eastAsia="Georgia" w:hAnsi="Georgia"/>
-          <w:b w:val="false"/>
-          <w:bCs w:val="false"/>
-          <w:i w:val="false"/>
-          <w:iCs w:val="false"/>
-          <w:color w:val="1D1D1D"/>
-          <w:sz w:val="22"/>
-          <w:szCs w:val="22"/>
-        </w:rPr>
-        <w:t xml:space="preserve">The following NICE-commissioned technology appraisals govern UK clinical practice for myeloma at the time of writing. Named entries re-verified for publication on 26 July 2026; live NICE verification remains required before prescribing. TA numbers and commissioning criteria are subject to revision. Several relevant appraisals are in development, in managed-access, or have been terminated, see Section 1A for the active landscape.</w:t>
+        <w:t>The following NICE-commissioned technology appraisals govern UK clinical practice for myeloma at the time of writing. Named entries re-verified for the v1.1 publication on 26 July 2026; live NICE verification remains required before prescribing. TA numbers and commissioning criteria are subject to revision. Several relevant appraisals are in development, in managed-access, or have been terminated, see Section 1A for the active landscape.</w:t>
       </w:r>
     </w:p>
     <w:p>
@@ -1792,17 +1703,7 @@
         <w:spacing w:after="40" w:before="40" w:line="280"/>
       </w:pPr>
       <w:r>
-        <w:rPr>
-          <w:rFonts w:ascii="Georgia" w:cs="Georgia" w:eastAsia="Georgia" w:hAnsi="Georgia"/>
-          <w:b w:val="false"/>
-          <w:bCs w:val="false"/>
-          <w:i w:val="false"/>
-          <w:iCs w:val="false"/>
-          <w:color w:val="1D1D1D"/>
-          <w:sz w:val="22"/>
-          <w:szCs w:val="22"/>
-        </w:rPr>
-        <w:t xml:space="preserve">GID-TA10726 / ID3843 — Daratumumab + bortezomib + lenalidomide + dexamethasone (D-VRd, PERSEUS-based) for untreated myeloma when stem cell transplant is unsuitable. Horizon / evidence only; NICE appraisal in development. Cited NICE in-development reference currently relates to transplant-unsuitable NDMM; verify live NICE indication before pathway placement. See Section 1A.</w:t>
+        <w:t>TA1170 — Daratumumab + bortezomib + lenalidomide + dexamethasone (D-VRd) for untreated multiple myeloma in adults when autologous stem cell transplant is unsuitable. Recommended by NICE on 24 June 2026, subject to the commercial arrangement. Confirm Blueteq, local formulary and implementation status before prescribing.</w:t>
       </w:r>
     </w:p>
     <w:p>
@@ -2249,15 +2150,7 @@
               <w:spacing w:after="80" w:before="0"/>
             </w:pPr>
             <w:r>
-              <w:rPr>
-                <w:rFonts w:ascii="Georgia" w:cs="Georgia" w:eastAsia="Georgia" w:hAnsi="Georgia"/>
-                <w:b/>
-                <w:bCs/>
-                <w:color w:val="1E5D8C"/>
-                <w:sz w:val="22"/>
-                <w:szCs w:val="22"/>
-              </w:rPr>
-              <w:t xml:space="preserve">Reviewer note</w:t>
+              <w:t>Governance note</w:t>
             </w:r>
           </w:p>
           <w:p>
@@ -2265,13 +2158,7 @@
               <w:spacing w:after="0" w:before="0" w:line="280"/>
             </w:pPr>
             <w:r>
-              <w:rPr>
-                <w:rFonts w:ascii="Georgia" w:cs="Georgia" w:eastAsia="Georgia" w:hAnsi="Georgia"/>
-                <w:color w:val="1D1D1D"/>
-                <w:sz w:val="22"/>
-                <w:szCs w:val="22"/>
-              </w:rPr>
-              <w:t xml:space="preserve">Pomalidomide + dex (TA427), elotuzumab, panobinostat (TA380), isatuximab combinations and several maintenance and earlier-line bispecific or CAR-T regimens have additional or older TAs; verify against the live NICE register before use. Daratumumab-containing quadruplet regimens for transplant-ineligible NDMM (D-Rd MAIA; D-VMP ALCYONE) are not explicitly linked to a verified NICE appraisal in this guideline, verify current NICE TA, Blueteq and local formulary status before use rather than presenting these as available.</w:t>
+              <w:t>Pomalidomide + dexamethasone (TA427), elotuzumab, panobinostat (TA380), isatuximab combinations and several maintenance and earlier-line bispecific or CAR-T regimens have additional or older TAs; verify against the live NICE register before use. D-VRd is separately recommended under TA1170 when ASCT is unsuitable. Other daratumumab-containing frontline regimens not explicitly linked to a verified NICE appraisal in this guideline must not be inferred to be commissioned; verify current NICE guidance, Blueteq and local formulary status.</w:t>
             </w:r>
           </w:p>
         </w:tc>
@@ -2571,15 +2458,7 @@
               <w:spacing w:after="0" w:before="0" w:line="260"/>
             </w:pPr>
             <w:r>
-              <w:rPr>
-                <w:rFonts w:ascii="Georgia" w:cs="Georgia" w:eastAsia="Georgia" w:hAnsi="Georgia"/>
-                <w:b w:val="false"/>
-                <w:bCs w:val="false"/>
-                <w:color w:val="1D1D1D"/>
-                <w:sz w:val="20"/>
-                <w:szCs w:val="20"/>
-              </w:rPr>
-              <w:t xml:space="preserve">D-VRd (daratumumab + bortezomib + lenalidomide + dexamethasone)</w:t>
+              <w:t>D-VRd (daratumumab + bortezomib + lenalidomide + dexamethasone)</w:t>
             </w:r>
           </w:p>
         </w:tc>
@@ -2604,15 +2483,7 @@
               <w:spacing w:after="0" w:before="0" w:line="260"/>
             </w:pPr>
             <w:r>
-              <w:rPr>
-                <w:rFonts w:ascii="Georgia" w:cs="Georgia" w:eastAsia="Georgia" w:hAnsi="Georgia"/>
-                <w:b w:val="false"/>
-                <w:bCs w:val="false"/>
-                <w:color w:val="1D1D1D"/>
-                <w:sz w:val="20"/>
-                <w:szCs w:val="20"/>
-              </w:rPr>
-              <w:t xml:space="preserve">Untreated myeloma when stem cell transplant is unsuitable</w:t>
+              <w:t>Untreated multiple myeloma when autologous stem cell transplant is unsuitable</w:t>
             </w:r>
           </w:p>
         </w:tc>
@@ -2637,15 +2508,7 @@
               <w:spacing w:after="0" w:before="0" w:line="260"/>
             </w:pPr>
             <w:r>
-              <w:rPr>
-                <w:rFonts w:ascii="Georgia" w:cs="Georgia" w:eastAsia="Georgia" w:hAnsi="Georgia"/>
-                <w:b w:val="false"/>
-                <w:bCs w:val="false"/>
-                <w:color w:val="1D1D1D"/>
-                <w:sz w:val="20"/>
-                <w:szCs w:val="20"/>
-              </w:rPr>
-              <w:t xml:space="preserve">In development: GID-TA10726 / ID3843. The previously listed NICE expected publication date of 13 May 2026 has passed; requires live NICE verification.</w:t>
+              <w:t>Recommended: TA1170, published 24 June 2026; subject to the commercial arrangement.</w:t>
             </w:r>
           </w:p>
         </w:tc>
@@ -2670,15 +2533,109 @@
               <w:spacing w:after="0" w:before="0" w:line="260"/>
             </w:pPr>
             <w:r>
-              <w:rPr>
-                <w:rFonts w:ascii="Georgia" w:cs="Georgia" w:eastAsia="Georgia" w:hAnsi="Georgia"/>
-                <w:b w:val="false"/>
-                <w:bCs w:val="false"/>
-                <w:color w:val="1D1D1D"/>
-                <w:sz w:val="20"/>
-                <w:szCs w:val="20"/>
-              </w:rPr>
-              <w:t xml:space="preserve">Treat as NICE horizon scanning only. Cited NICE in-development entry currently relates to transplant-unsuitable NDMM. Do not describe as routinely commissioned, and do not place D-VRd as a transplant-eligible NICE in-development option, unless final NICE guidance and Blueteq/formulary access confirm this.</w:t>
+              <w:t>Can be used routinely across the NHS in this population and must be funded in England within 90 days. Confirm Blueteq, local formulary and implementation status.</w:t>
+            </w:r>
+          </w:p>
+        </w:tc>
+      </w:tr>
+      <w:tr>
+        <w:tc>
+          <w:tcPr>
+            <w:tcW w:type="dxa" w:w="2200"/>
+            <w:tcBorders>
+              <w:top w:val="single" w:color="D8C9CB" w:sz="4"/>
+              <w:left w:val="single" w:color="D8C9CB" w:sz="4"/>
+              <w:bottom w:val="single" w:color="D8C9CB" w:sz="4"/>
+              <w:right w:val="single" w:color="D8C9CB" w:sz="4"/>
+            </w:tcBorders>
+            <w:tcMar>
+              <w:top w:type="dxa" w:w="80"/>
+              <w:left w:type="dxa" w:w="120"/>
+              <w:bottom w:type="dxa" w:w="80"/>
+              <w:right w:type="dxa" w:w="120"/>
+            </w:tcMar>
+          </w:tcPr>
+          <w:p>
+            <w:pPr>
+              <w:spacing w:after="0" w:before="0" w:line="260"/>
+            </w:pPr>
+            <w:r>
+              <w:t>D-VRd (daratumumab + bortezomib + lenalidomide + dexamethasone)</w:t>
+            </w:r>
+          </w:p>
+        </w:tc>
+        <w:tc>
+          <w:tcPr>
+            <w:tcW w:type="dxa" w:w="2200"/>
+            <w:tcBorders>
+              <w:top w:val="single" w:color="D8C9CB" w:sz="4"/>
+              <w:left w:val="single" w:color="D8C9CB" w:sz="4"/>
+              <w:bottom w:val="single" w:color="D8C9CB" w:sz="4"/>
+              <w:right w:val="single" w:color="D8C9CB" w:sz="4"/>
+            </w:tcBorders>
+            <w:tcMar>
+              <w:top w:type="dxa" w:w="80"/>
+              <w:left w:type="dxa" w:w="120"/>
+              <w:bottom w:type="dxa" w:w="80"/>
+              <w:right w:type="dxa" w:w="120"/>
+            </w:tcMar>
+          </w:tcPr>
+          <w:p>
+            <w:pPr>
+              <w:spacing w:after="0" w:before="0" w:line="260"/>
+            </w:pPr>
+            <w:r>
+              <w:t>Untreated myeloma when high-dose chemotherapy and autologous stem cell transplant are suitable</w:t>
+            </w:r>
+          </w:p>
+        </w:tc>
+        <w:tc>
+          <w:tcPr>
+            <w:tcW w:type="dxa" w:w="2200"/>
+            <w:tcBorders>
+              <w:top w:val="single" w:color="D8C9CB" w:sz="4"/>
+              <w:left w:val="single" w:color="D8C9CB" w:sz="4"/>
+              <w:bottom w:val="single" w:color="D8C9CB" w:sz="4"/>
+              <w:right w:val="single" w:color="D8C9CB" w:sz="4"/>
+            </w:tcBorders>
+            <w:tcMar>
+              <w:top w:type="dxa" w:w="80"/>
+              <w:left w:type="dxa" w:w="120"/>
+              <w:bottom w:type="dxa" w:w="80"/>
+              <w:right w:type="dxa" w:w="120"/>
+            </w:tcMar>
+          </w:tcPr>
+          <w:p>
+            <w:pPr>
+              <w:spacing w:after="0" w:before="0" w:line="260"/>
+            </w:pPr>
+            <w:r>
+              <w:t>In development: GID-TA11254 / ID6249; expected publication TBC.</w:t>
+            </w:r>
+          </w:p>
+        </w:tc>
+        <w:tc>
+          <w:tcPr>
+            <w:tcW w:type="dxa" w:w="2426"/>
+            <w:tcBorders>
+              <w:top w:val="single" w:color="D8C9CB" w:sz="4"/>
+              <w:left w:val="single" w:color="D8C9CB" w:sz="4"/>
+              <w:bottom w:val="single" w:color="D8C9CB" w:sz="4"/>
+              <w:right w:val="single" w:color="D8C9CB" w:sz="4"/>
+            </w:tcBorders>
+            <w:tcMar>
+              <w:top w:type="dxa" w:w="80"/>
+              <w:left w:type="dxa" w:w="120"/>
+              <w:bottom w:type="dxa" w:w="80"/>
+              <w:right w:type="dxa" w:w="120"/>
+            </w:tcMar>
+          </w:tcPr>
+          <w:p>
+            <w:pPr>
+              <w:spacing w:after="0" w:before="0" w:line="260"/>
+            </w:pPr>
+            <w:r>
+              <w:t>Separate transplant-eligible appraisal. Not NICE-commissioned for this setting unless final guidance and local access confirm it.</w:t>
             </w:r>
           </w:p>
         </w:tc>
@@ -4062,29 +4019,9 @@
               <w:spacing w:after="80" w:before="0"/>
             </w:pPr>
             <w:r>
-              <w:rPr>
-                <w:rFonts w:ascii="Georgia" w:cs="Georgia" w:eastAsia="Georgia" w:hAnsi="Georgia"/>
-                <w:b/>
-                <w:bCs/>
-                <w:color w:val="C87A00"/>
-                <w:sz w:val="22"/>
-                <w:szCs w:val="22"/>
-              </w:rPr>
-              <w:t xml:space="preserve">Verification requirements before any clinical use</w:t>
-            </w:r>
-          </w:p>
-          <w:p>
-            <w:pPr>
-              <w:spacing w:after="0" w:before="0" w:line="280"/>
-            </w:pPr>
-            <w:r>
-              <w:rPr>
-                <w:rFonts w:ascii="Georgia" w:cs="Georgia" w:eastAsia="Georgia" w:hAnsi="Georgia"/>
-                <w:color w:val="1D1D1D"/>
-                <w:sz w:val="22"/>
-                <w:szCs w:val="22"/>
-              </w:rPr>
-              <w:t xml:space="preserve">NICE horizon-scanning section checked against live NICE pages immediately before deployment. Distinction confirmed between currently recommended, managed-access, in-development, awaiting-development, discontinued and terminated appraisals. D-VRd identifier verified as GID-TA10726 / ID3843 unless NICE has since issued final TA guidance with a new TA number. Cilta-cel TA889 (terminated) and GID-TA10905 / ID4012 (in development) kept separate at every point in this document. Ixazomib maintenance GID-TA10843 labelled discontinued, not in development, at every point in this document.</w:t>
+              <w:t>Verification requirements before any clinical use</w:t>
+              <w:br/>
+              <w:t>D-VRd settings kept separate: TA1170 for untreated myeloma when ASCT is unsuitable; GID-TA11254 / ID6249 remains in development when high-dose chemotherapy and ASCT are suitable. Live NICE, Blueteq, local formulary, SmPC and pharmacy verification remain mandatory.</w:t>
             </w:r>
           </w:p>
         </w:tc>
@@ -10227,17 +10164,7 @@
         <w:spacing w:after="40" w:before="40" w:line="280"/>
       </w:pPr>
       <w:r>
-        <w:rPr>
-          <w:rFonts w:ascii="Georgia" w:cs="Georgia" w:eastAsia="Georgia" w:hAnsi="Georgia"/>
-          <w:b w:val="false"/>
-          <w:bCs w:val="false"/>
-          <w:i w:val="false"/>
-          <w:iCs w:val="false"/>
-          <w:color w:val="1D1D1D"/>
-          <w:sz w:val="22"/>
-          <w:szCs w:val="22"/>
-        </w:rPr>
-        <w:t xml:space="preserve">QuiRedex and SWOG E3A06 showed benefit from early lenalidomide-based therapy in high-risk SMM. Treatment of SMM is not NHS standard of care outside trials as at the v1.0 publication review.</w:t>
+        <w:t>QuiRedex and SWOG E3A06 showed benefit from early lenalidomide-based therapy in high-risk SMM. Treatment of SMM is not NHS standard of care outside trials as at the v1.1 publication review.</w:t>
       </w:r>
     </w:p>
     <w:p>
@@ -12844,17 +12771,7 @@
         <w:jc w:val="left"/>
       </w:pPr>
       <w:r>
-        <w:rPr>
-          <w:rFonts w:ascii="Georgia" w:cs="Georgia" w:eastAsia="Georgia" w:hAnsi="Georgia"/>
-          <w:b w:val="false"/>
-          <w:bCs w:val="false"/>
-          <w:i w:val="false"/>
-          <w:iCs w:val="false"/>
-          <w:color w:val="1D1D1D"/>
-          <w:sz w:val="22"/>
-          <w:szCs w:val="22"/>
-        </w:rPr>
-        <w:t xml:space="preserve">Standard UK NHS induction has been a bortezomib-based triplet (most commonly VTd or VCd) followed by ASCT with melphalan 200 mg/m squared conditioning and lenalidomide maintenance until progression (TA680). Daratumumab-containing quadruplet induction is increasingly used in line with the CASSIOPEIA evidence base and current NICE technology appraisals. The current NICE-commissioned quadruplet for the transplant-eligible setting is D-VTd (TA763, within NICE criteria). D-VRd (PERSEUS-based) is the subject of an in-development NICE appraisal under identifier GID-TA10726 / ID3843 (the v0.3 draft incorrectly cited TA11254 — corrected in v0.4); the cited NICE in-development reference relates to transplant-unsuitable NDMM, not transplant-eligible disease. D-VRd should be treated as horizon/evidence content only for the TE-NDMM pathway pending final NICE guidance and verified pathway placement.</w:t>
+        <w:t>Standard UK NHS induction has been a bortezomib-based triplet (most commonly VTd or VCd) followed by ASCT with melphalan 200 mg/m squared conditioning and lenalidomide maintenance until progression (TA680). Daratumumab-containing quadruplet induction is increasingly used in line with the CASSIOPEIA evidence base and current NICE technology appraisals. The current NICE-commissioned quadruplet for the transplant-eligible setting is D-VTd (TA763, within NICE criteria). D-VRd (PERSEUS-based) is under separate NICE appraisal for untreated myeloma when high-dose chemotherapy and autologous stem cell transplant are suitable (GID-TA11254 / ID6249, in development; expected publication TBC). D-VRd remains horizon/evidence content only for the transplant-eligible pathway pending final NICE guidance and verified pathway placement.</w:t>
       </w:r>
     </w:p>
     <w:tbl>
@@ -13761,72 +13678,6 @@
         <w:t xml:space="preserve">Pragmatic option in older or frail patients. Dose-reduce dexamethasone to 20 mg weekly in those aged 75 or over or frail by IMWG frailty score. Continuous lenalidomide (Rd) outperforms fixed-duration Rd18.</w:t>
       </w:r>
     </w:p>
-    <w:tbl>
-      <w:tblPr>
-        <w:tblW w:type="dxa" w:w="9026"/>
-        <w:tblBorders>
-          <w:top w:val="single" w:color="auto" w:sz="4"/>
-          <w:left w:val="single" w:color="auto" w:sz="4"/>
-          <w:bottom w:val="single" w:color="auto" w:sz="4"/>
-          <w:right w:val="single" w:color="auto" w:sz="4"/>
-          <w:insideH w:val="single" w:color="auto" w:sz="4"/>
-          <w:insideV w:val="single" w:color="auto" w:sz="4"/>
-        </w:tblBorders>
-      </w:tblPr>
-      <w:tblGrid>
-        <w:gridCol w:w="9026"/>
-      </w:tblGrid>
-      <w:tr>
-        <w:tc>
-          <w:tcPr>
-            <w:tcW w:type="dxa" w:w="9026"/>
-            <w:tcBorders>
-              <w:top w:val="single" w:color="D8C9CB" w:sz="4"/>
-              <w:left w:val="single" w:color="C87A00" w:sz="16"/>
-              <w:bottom w:val="single" w:color="D8C9CB" w:sz="4"/>
-              <w:right w:val="single" w:color="D8C9CB" w:sz="4"/>
-            </w:tcBorders>
-            <w:shd w:fill="FFF4E0" w:val="clear"/>
-            <w:tcMar>
-              <w:top w:type="dxa" w:w="140"/>
-              <w:left w:type="dxa" w:w="200"/>
-              <w:bottom w:type="dxa" w:w="140"/>
-              <w:right w:type="dxa" w:w="160"/>
-            </w:tcMar>
-          </w:tcPr>
-          <w:p>
-            <w:pPr>
-              <w:spacing w:after="80" w:before="0"/>
-            </w:pPr>
-            <w:r>
-              <w:rPr>
-                <w:rFonts w:ascii="Georgia" w:cs="Georgia" w:eastAsia="Georgia" w:hAnsi="Georgia"/>
-                <w:b/>
-                <w:bCs/>
-                <w:color w:val="C87A00"/>
-                <w:sz w:val="22"/>
-                <w:szCs w:val="22"/>
-              </w:rPr>
-              <w:t xml:space="preserve">Reviewer note — daratumumab-containing quadruplets for transplant-ineligible NDMM</w:t>
-            </w:r>
-          </w:p>
-          <w:p>
-            <w:pPr>
-              <w:spacing w:after="0" w:before="0" w:line="280"/>
-            </w:pPr>
-            <w:r>
-              <w:rPr>
-                <w:rFonts w:ascii="Georgia" w:cs="Georgia" w:eastAsia="Georgia" w:hAnsi="Georgia"/>
-                <w:color w:val="1D1D1D"/>
-                <w:sz w:val="22"/>
-                <w:szCs w:val="22"/>
-              </w:rPr>
-              <w:t xml:space="preserve">Daratumumab-containing quadruplet regimens for transplant-ineligible NDMM (D-Rd per MAIA; D-VMP per ALCYONE) are not explicitly linked to a verified NICE appraisal in this guideline. Verify current NICE TA, Blueteq and local formulary status before use rather than presenting these regimens as available. Isa-VRd is listed under TA1098 for untreated myeloma when stem cell transplant is unsuitable.</w:t>
-            </w:r>
-          </w:p>
-        </w:tc>
-      </w:tr>
-    </w:tbl>
     <w:p>
       <w:pPr>
         <w:spacing w:after="40" w:before="160" w:line="300"/>
@@ -14025,17 +13876,7 @@
         <w:jc w:val="left"/>
       </w:pPr>
       <w:r>
-        <w:rPr>
-          <w:rFonts w:ascii="Georgia" w:cs="Georgia" w:eastAsia="Georgia" w:hAnsi="Georgia"/>
-          <w:b/>
-          <w:bCs/>
-          <w:i w:val="false"/>
-          <w:iCs w:val="false"/>
-          <w:color w:val="7A1F2B"/>
-          <w:sz w:val="23"/>
-          <w:szCs w:val="23"/>
-        </w:rPr>
-        <w:t xml:space="preserve">Daratumumab + bortezomib + lenalidomide + dexamethasone (D-VRd, PERSEUS) — horizon/evidence only</w:t>
+        <w:t>Daratumumab + bortezomib + lenalidomide + dexamethasone (D-VRd) — transplant-ineligible NDMM</w:t>
       </w:r>
     </w:p>
     <w:p>
@@ -14044,43 +13885,7 @@
         <w:jc w:val="left"/>
       </w:pPr>
       <w:r>
-        <w:rPr>
-          <w:rFonts w:ascii="Georgia" w:cs="Georgia" w:eastAsia="Georgia" w:hAnsi="Georgia"/>
-          <w:b/>
-          <w:bCs/>
-          <w:i w:val="false"/>
-          <w:iCs w:val="false"/>
-          <w:color w:val="C87A00"/>
-          <w:sz w:val="20"/>
-          <w:szCs w:val="20"/>
-        </w:rPr>
-        <w:t xml:space="preserve">NICE GID-TA10726 / ID3843 — in development</w:t>
-      </w:r>
-      <w:r>
-        <w:rPr>
-          <w:rFonts w:ascii="Georgia" w:cs="Georgia" w:eastAsia="Georgia" w:hAnsi="Georgia"/>
-          <w:b w:val="false"/>
-          <w:bCs w:val="false"/>
-          <w:i w:val="false"/>
-          <w:iCs w:val="false"/>
-          <w:color w:val="1D1D1D"/>
-          <w:sz w:val="22"/>
-          <w:szCs w:val="22"/>
-        </w:rPr>
-        <w:t xml:space="preserve">   </w:t>
-      </w:r>
-      <w:r>
-        <w:rPr>
-          <w:rFonts w:ascii="Georgia" w:cs="Georgia" w:eastAsia="Georgia" w:hAnsi="Georgia"/>
-          <w:b/>
-          <w:bCs/>
-          <w:i w:val="false"/>
-          <w:iCs w:val="false"/>
-          <w:color w:val="2A6B3B"/>
-          <w:sz w:val="20"/>
-          <w:szCs w:val="20"/>
-        </w:rPr>
-        <w:t xml:space="preserve">High / Strong (trial evidence)</w:t>
+        <w:t>NICE TA1170 — recommended for ASCT-unsuitable untreated myeloma</w:t>
       </w:r>
     </w:p>
     <w:p>
@@ -14089,30 +13894,7 @@
         <w:jc w:val="left"/>
       </w:pPr>
       <w:r>
-        <w:rPr>
-          <w:rFonts w:ascii="Georgia" w:cs="Georgia" w:eastAsia="Georgia" w:hAnsi="Georgia"/>
-          <w:b/>
-          <w:bCs/>
-          <w:i w:val="false"/>
-          <w:iCs w:val="false"/>
-          <w:color w:val="1D1D1D"/>
-          <w:sz w:val="22"/>
-          <w:szCs w:val="22"/>
-        </w:rPr>
-        <w:t xml:space="preserve">Pathway placement: </w:t>
-      </w:r>
-      <w:r>
-        <w:rPr>
-          <w:rFonts w:ascii="Georgia" w:cs="Georgia" w:eastAsia="Georgia" w:hAnsi="Georgia"/>
-          <w:b w:val="false"/>
-          <w:bCs w:val="false"/>
-          <w:i w:val="false"/>
-          <w:iCs w:val="false"/>
-          <w:color w:val="1D1D1D"/>
-          <w:sz w:val="22"/>
-          <w:szCs w:val="22"/>
-        </w:rPr>
-        <w:t xml:space="preserve">Horizon/evidence only. Cited NICE GID-TA10726 / ID3843 currently relates to untreated myeloma when stem cell transplant is unsuitable. Verify live NICE indication before pathway placement. Not commissioned for the transplant-eligible setting.</w:t>
+        <w:t>Pathway placement: NICE-recommended under TA1170 for untreated multiple myeloma in adults when autologous stem cell transplant is unsuitable, subject to the commercial arrangement.</w:t>
       </w:r>
     </w:p>
     <w:p>
@@ -14121,30 +13903,7 @@
         <w:jc w:val="left"/>
       </w:pPr>
       <w:r>
-        <w:rPr>
-          <w:rFonts w:ascii="Georgia" w:cs="Georgia" w:eastAsia="Georgia" w:hAnsi="Georgia"/>
-          <w:b/>
-          <w:bCs/>
-          <w:i w:val="false"/>
-          <w:iCs w:val="false"/>
-          <w:color w:val="1D1D1D"/>
-          <w:sz w:val="22"/>
-          <w:szCs w:val="22"/>
-        </w:rPr>
-        <w:t xml:space="preserve">Dose: </w:t>
-      </w:r>
-      <w:r>
-        <w:rPr>
-          <w:rFonts w:ascii="Georgia" w:cs="Georgia" w:eastAsia="Georgia" w:hAnsi="Georgia"/>
-          <w:b w:val="false"/>
-          <w:bCs w:val="false"/>
-          <w:i w:val="false"/>
-          <w:iCs w:val="false"/>
-          <w:color w:val="1D1D1D"/>
-          <w:sz w:val="22"/>
-          <w:szCs w:val="22"/>
-        </w:rPr>
-        <w:t xml:space="preserve">Daratumumab subcutaneous schedule + bortezomib 1.3 mg/m squared SC + lenalidomide 25 mg PO days 1 to 21 + dexamethasone, in 28-day cycles, induction (four cycles), ASCT (in the PERSEUS trial), consolidation (two cycles), D-R maintenance. Dose example only — verify against current SmPC, local e-prescribing protocol, renal/hepatic and frailty modifications, and pharmacy verification before any prescribing.</w:t>
+        <w:t>Dose: Use the current SmPC and a pharmacy-controlled local protocol. No dose example is provided here for the TA1170 pathway. Verify renal/hepatic and frailty modifications, drug interactions, Blueteq, local formulary implementation and pharmacy approval before prescribing.</w:t>
       </w:r>
     </w:p>
     <w:p>
@@ -14153,30 +13912,7 @@
         <w:jc w:val="left"/>
       </w:pPr>
       <w:r>
-        <w:rPr>
-          <w:rFonts w:ascii="Georgia" w:cs="Georgia" w:eastAsia="Georgia" w:hAnsi="Georgia"/>
-          <w:b/>
-          <w:bCs/>
-          <w:i w:val="false"/>
-          <w:iCs w:val="false"/>
-          <w:color w:val="1D1D1D"/>
-          <w:sz w:val="22"/>
-          <w:szCs w:val="22"/>
-        </w:rPr>
-        <w:t xml:space="preserve">Trial basis: </w:t>
-      </w:r>
-      <w:r>
-        <w:rPr>
-          <w:rFonts w:ascii="Georgia" w:cs="Georgia" w:eastAsia="Georgia" w:hAnsi="Georgia"/>
-          <w:b w:val="false"/>
-          <w:bCs w:val="false"/>
-          <w:i w:val="false"/>
-          <w:iCs w:val="false"/>
-          <w:color w:val="1D1D1D"/>
-          <w:sz w:val="22"/>
-          <w:szCs w:val="22"/>
-        </w:rPr>
-        <w:t xml:space="preserve">PERSEUS (Sonneveld et al., NEJM 2024). D-VRd induction and consolidation with D-R maintenance improved PFS over VRd with R maintenance, with deeper MRD response. PERSEUS was conducted in transplant-eligible NDMM; the NICE in-development appraisal under GID-TA10726 / ID3843 addresses the transplant-unsuitable population specifically.</w:t>
+        <w:t>NICE TA: TA1170, published 24 June 2026. NICE states that D-VRd can be used routinely across the NHS in this population and must be funded in England within 90 days of final publication.</w:t>
       </w:r>
     </w:p>
     <w:p>
@@ -14185,30 +13921,7 @@
         <w:jc w:val="left"/>
       </w:pPr>
       <w:r>
-        <w:rPr>
-          <w:rFonts w:ascii="Georgia" w:cs="Georgia" w:eastAsia="Georgia" w:hAnsi="Georgia"/>
-          <w:b/>
-          <w:bCs/>
-          <w:i w:val="false"/>
-          <w:iCs w:val="false"/>
-          <w:color w:val="1D1D1D"/>
-          <w:sz w:val="22"/>
-          <w:szCs w:val="22"/>
-        </w:rPr>
-        <w:t xml:space="preserve">Notes: Not presented as routinely commissioned in this guideline.</w:t>
-      </w:r>
-      <w:r>
-        <w:rPr>
-          <w:rFonts w:ascii="Georgia" w:cs="Georgia" w:eastAsia="Georgia" w:hAnsi="Georgia"/>
-          <w:b w:val="false"/>
-          <w:bCs w:val="false"/>
-          <w:i w:val="false"/>
-          <w:iCs w:val="false"/>
-          <w:color w:val="1D1D1D"/>
-          <w:sz w:val="22"/>
-          <w:szCs w:val="22"/>
-        </w:rPr>
-        <w:t xml:space="preserve"> The v0.3 draft incorrectly cited TA11254; corrected to GID-TA10726 / ID3843 in v0.4 and the indication clarified as transplant-unsuitable in v0.4.1. Do not present as routinely commissioned. See Section 1A NICE Horizon Scanning.</w:t>
+        <w:t>Notes: Keep this transplant-ineligible recommendation separate from the transplant-eligible appraisal GID-TA11254 / ID6249, which remains in development. Confirm Blueteq, local formulary implementation and pharmacy approval before prescribing.</w:t>
       </w:r>
     </w:p>
     <w:p>
@@ -24481,17 +24194,7 @@
         <w:spacing w:after="40" w:before="40" w:line="280"/>
       </w:pPr>
       <w:r>
-        <w:rPr>
-          <w:rFonts w:ascii="Georgia" w:cs="Georgia" w:eastAsia="Georgia" w:hAnsi="Georgia"/>
-          <w:b w:val="false"/>
-          <w:bCs w:val="false"/>
-          <w:i w:val="false"/>
-          <w:iCs w:val="false"/>
-          <w:color w:val="1D1D1D"/>
-          <w:sz w:val="22"/>
-          <w:szCs w:val="22"/>
-        </w:rPr>
-        <w:t xml:space="preserve">D-VRd identifier confirmed as GID-TA10726 / ID3843 unless NICE has since issued final TA guidance with a new TA number, in which case replace throughout.</w:t>
+        <w:t>D-VRd settings kept separate throughout: TA1170 when ASCT is unsuitable; GID-TA11254 / ID6249 remains in development when high-dose chemotherapy and ASCT are suitable.</w:t>
       </w:r>
     </w:p>
     <w:p>
@@ -24681,17 +24384,7 @@
         <w:spacing w:after="40" w:before="40" w:line="280"/>
       </w:pPr>
       <w:r>
-        <w:rPr>
-          <w:rFonts w:ascii="Georgia" w:cs="Georgia" w:eastAsia="Georgia" w:hAnsi="Georgia"/>
-          <w:b w:val="false"/>
-          <w:bCs w:val="false"/>
-          <w:i w:val="false"/>
-          <w:iCs w:val="false"/>
-          <w:color w:val="1D1D1D"/>
-          <w:sz w:val="22"/>
-          <w:szCs w:val="22"/>
-        </w:rPr>
-        <w:t xml:space="preserve">Several relevant appraisals remain in development: GID-TA10726 / ID3843 (D-VRd), TA11465 (isatuximab combinations induction), GID-TA10905 / ID4012 (cilta-cel earlier line), GID-TA11846 / ID6639 (isatuximab maintenance). This document will be updated when relevant guidance is published.</w:t>
+        <w:t>D-VRd is recommended for transplant-ineligible NDMM under TA1170; the separate transplant-eligible appraisal GID-TA11254 / ID6249 remains in development. Other relevant appraisals remain in development, including TA11465, GID-TA10905 / ID4012 and GID-TA11846 / ID6639.</w:t>
       </w:r>
     </w:p>
     <w:p>
@@ -27335,17 +27028,7 @@
         <w:spacing w:after="40" w:before="40" w:line="280"/>
       </w:pPr>
       <w:r>
-        <w:rPr>
-          <w:rFonts w:ascii="Georgia" w:cs="Georgia" w:eastAsia="Georgia" w:hAnsi="Georgia"/>
-          <w:b w:val="false"/>
-          <w:bCs w:val="false"/>
-          <w:i w:val="false"/>
-          <w:iCs w:val="false"/>
-          <w:color w:val="1D1D1D"/>
-          <w:sz w:val="22"/>
-          <w:szCs w:val="22"/>
-        </w:rPr>
-        <w:t xml:space="preserve">In development: GID-TA10726 / ID3843 (D-VRd, PERSEUS); GID-TA10905 / ID4012 (cilta-cel after 1 to 3 therapies); GID-TA11846 / ID6639 (isatuximab maintenance after ASCT).</w:t>
+        <w:t>TA1170: D-VRd for untreated multiple myeloma when ASCT is unsuitable. In development: GID-TA11254 / ID6249 (D-VRd when high-dose chemotherapy and ASCT are suitable); GID-TA10905 / ID4012; GID-TA11846 / ID6639.</w:t>
       </w:r>
     </w:p>
     <w:p>
@@ -28582,6 +28265,48 @@
           <w:p>
             <w:r>
               <w:t>First published release. Consultant approval and pharmacy verification confirmed by the clinical owner. NICE/appraisal status, Blueteq and formulary controls, dose and adjustment language, supportive-care controls, approved-centre pathways and belantamab ophthalmology pathway confirmed checked. Publication status and metadata updated; clinical recommendations unchanged from v0.4.1.</w:t>
+            </w:r>
+          </w:p>
+        </w:tc>
+      </w:tr>
+      <w:tr>
+        <w:tc>
+          <w:tcPr>
+            <w:tcW w:type="dxa" w:w="1200"/>
+          </w:tcPr>
+          <w:p>
+            <w:r>
+              <w:t>v1.1 PUBLISHED</w:t>
+            </w:r>
+          </w:p>
+        </w:tc>
+        <w:tc>
+          <w:tcPr>
+            <w:tcW w:type="dxa" w:w="1400"/>
+          </w:tcPr>
+          <w:p>
+            <w:r>
+              <w:t>26 July 2026</w:t>
+            </w:r>
+          </w:p>
+        </w:tc>
+        <w:tc>
+          <w:tcPr>
+            <w:tcW w:type="dxa" w:w="2400"/>
+          </w:tcPr>
+          <w:p>
+            <w:r>
+              <w:t>Dr M Mohsin</w:t>
+            </w:r>
+          </w:p>
+        </w:tc>
+        <w:tc>
+          <w:tcPr>
+            <w:tcW w:type="dxa" w:w="4026"/>
+          </w:tcPr>
+          <w:p>
+            <w:r>
+              <w:t>D-VRd is NICE-recommended under TA1170 when ASCT is unsuitable; separate transplant-eligible appraisal GID-TA11254 / ID6249 remains in development. Clinical owner approval and pharmacy verification confirmed; pharmacist's name retained privately.</w:t>
             </w:r>
           </w:p>
         </w:tc>
@@ -28854,15 +28579,7 @@
       <w:jc w:val="left"/>
     </w:pPr>
     <w:r>
-      <w:rPr>
-        <w:rFonts w:ascii="Georgia" w:cs="Georgia" w:eastAsia="Georgia" w:hAnsi="Georgia"/>
-        <w:b/>
-        <w:bCs/>
-        <w:color w:val="7A1F2B"/>
-        <w:sz w:val="18"/>
-        <w:szCs w:val="18"/>
-      </w:rPr>
-      <w:t>MHA-MYELOMA-2026-v1.0 (PUBLISHED)</w:t>
+      <w:t>MHA-MYELOMA-2026-v1.1 (PUBLISHED)</w:t>
     </w:r>
   </w:p>
 </w:hdr>

</xml_diff>

<commit_message>
Publish Myeloma v1.1 structure and D-VRd status update (#62)
* feat: align myeloma navigation and algorithms with CLL

* feat: publish myeloma v1.1 pathway update
</commit_message>
<xml_diff>
--- a/guidelines/myeloma/guideline.docx
+++ b/guidelines/myeloma/guideline.docx
@@ -74,15 +74,7 @@
         <w:jc w:val="center"/>
       </w:pPr>
       <w:r>
-        <w:rPr>
-          <w:rFonts w:ascii="Georgia" w:cs="Georgia" w:eastAsia="Georgia" w:hAnsi="Georgia"/>
-          <w:b/>
-          <w:bCs/>
-          <w:color w:val="7A1F2B"/>
-          <w:sz w:val="22"/>
-          <w:szCs w:val="22"/>
-        </w:rPr>
-        <w:t>MHA-MYELOMA-2026-v1.0</w:t>
+        <w:t>MHA-MYELOMA-2026-v1.1</w:t>
       </w:r>
     </w:p>
     <w:p>
@@ -91,15 +83,7 @@
         <w:jc w:val="center"/>
       </w:pPr>
       <w:r>
-        <w:rPr>
-          <w:rFonts w:ascii="Georgia" w:cs="Georgia" w:eastAsia="Georgia" w:hAnsi="Georgia"/>
-          <w:b/>
-          <w:bCs/>
-          <w:color w:val="C87A00"/>
-          <w:sz w:val="22"/>
-          <w:szCs w:val="22"/>
-        </w:rPr>
-        <w:t>PUBLISHED EDUCATIONAL GUIDELINE — v1.0</w:t>
+        <w:t>PUBLISHED EDUCATIONAL GUIDELINE — v1.1</w:t>
       </w:r>
     </w:p>
     <w:p>
@@ -108,15 +92,7 @@
         <w:jc w:val="center"/>
       </w:pPr>
       <w:r>
-        <w:rPr>
-          <w:rFonts w:ascii="Georgia" w:cs="Georgia" w:eastAsia="Georgia" w:hAnsi="Georgia"/>
-          <w:i/>
-          <w:iCs/>
-          <w:color w:val="4A4A4A"/>
-          <w:sz w:val="20"/>
-          <w:szCs w:val="20"/>
-        </w:rPr>
-        <w:t>Consultant approval and pharmacy verification confirmed by the clinical owner on 26 July 2026</w:t>
+        <w:t>Clinical owner approval and pharmacy verification confirmed on 26 July 2026; pharmacist name retained privately</w:t>
       </w:r>
     </w:p>
     <w:p>
@@ -349,15 +325,7 @@
               <w:spacing w:after="0" w:before="0" w:line="260"/>
             </w:pPr>
             <w:r>
-              <w:rPr>
-                <w:rFonts w:ascii="Georgia" w:cs="Georgia" w:eastAsia="Georgia" w:hAnsi="Georgia"/>
-                <w:b w:val="false"/>
-                <w:bCs w:val="false"/>
-                <w:color w:val="1D1D1D"/>
-                <w:sz w:val="20"/>
-                <w:szCs w:val="20"/>
-              </w:rPr>
-              <w:t>MHA-MYELOMA-2026-v1.0</w:t>
+              <w:t>MHA-MYELOMA-2026-v1.1</w:t>
             </w:r>
           </w:p>
         </w:tc>
@@ -485,15 +453,7 @@
               <w:spacing w:after="0" w:before="0" w:line="260"/>
             </w:pPr>
             <w:r>
-              <w:rPr>
-                <w:rFonts w:ascii="Georgia" w:cs="Georgia" w:eastAsia="Georgia" w:hAnsi="Georgia"/>
-                <w:b w:val="false"/>
-                <w:bCs w:val="false"/>
-                <w:color w:val="1D1D1D"/>
-                <w:sz w:val="20"/>
-                <w:szCs w:val="20"/>
-              </w:rPr>
-              <w:t>v1.0 — published 26 July 2026</w:t>
+              <w:t>v1.1 — published 26 July 2026</w:t>
             </w:r>
           </w:p>
         </w:tc>
@@ -689,15 +649,7 @@
               <w:spacing w:after="0" w:before="0" w:line="260"/>
             </w:pPr>
             <w:r>
-              <w:rPr>
-                <w:rFonts w:ascii="Georgia" w:cs="Georgia" w:eastAsia="Georgia" w:hAnsi="Georgia"/>
-                <w:b w:val="false"/>
-                <w:bCs w:val="false"/>
-                <w:color w:val="1D1D1D"/>
-                <w:sz w:val="20"/>
-                <w:szCs w:val="20"/>
-              </w:rPr>
-              <w:t>PUBLISHED EDUCATIONAL GUIDELINE — consultant approval and pharmacy verification confirmed by the clinical owner on 26 July 2026</w:t>
+              <w:t>PUBLISHED EDUCATIONAL GUIDELINE — v1.1. Clinical owner approval and pharmacy verification confirmed on 26 July 2026; the pharmacist's name remains private.</w:t>
             </w:r>
           </w:p>
         </w:tc>
@@ -1136,15 +1088,7 @@
               <w:spacing w:after="0" w:before="0" w:line="260"/>
             </w:pPr>
             <w:r>
-              <w:rPr>
-                <w:rFonts w:ascii="Georgia" w:cs="Georgia" w:eastAsia="Georgia" w:hAnsi="Georgia"/>
-                <w:b w:val="false"/>
-                <w:bCs w:val="false"/>
-                <w:color w:val="1D1D1D"/>
-                <w:sz w:val="20"/>
-                <w:szCs w:val="20"/>
-              </w:rPr>
-              <w:t xml:space="preserve">v1.0 PUBLISHED: consultant approval and pharmacy verification confirmed on 26 July 2026; clinical recommendations unchanged from v0.4.1; Dr Muhammad Mohsin, Consultant Haematologist.</w:t>
+              <w:t>v1.1 PUBLISHED: D-VRd updated to TA1170 for ASCT-unsuitable untreated myeloma; GID-TA11254 / ID6249 recorded as in development for ASCT-suitable untreated myeloma. Clinical owner approval and pharmacy verification confirmed on 26 July 2026.</w:t>
             </w:r>
           </w:p>
         </w:tc>
@@ -1389,30 +1333,7 @@
         <w:spacing w:after="40" w:before="40" w:line="280"/>
       </w:pPr>
       <w:r>
-        <w:rPr>
-          <w:rFonts w:ascii="Georgia" w:cs="Georgia" w:eastAsia="Georgia" w:hAnsi="Georgia"/>
-          <w:b/>
-          <w:bCs/>
-          <w:i w:val="false"/>
-          <w:iCs w:val="false"/>
-          <w:color w:val="7A1F2B"/>
-          <w:sz w:val="22"/>
-          <w:szCs w:val="22"/>
-        </w:rPr>
-        <w:t xml:space="preserve">NDMM transplant-eligible (standard risk): </w:t>
-      </w:r>
-      <w:r>
-        <w:rPr>
-          <w:rFonts w:ascii="Georgia" w:cs="Georgia" w:eastAsia="Georgia" w:hAnsi="Georgia"/>
-          <w:b w:val="false"/>
-          <w:bCs w:val="false"/>
-          <w:i w:val="false"/>
-          <w:iCs w:val="false"/>
-          <w:color w:val="1D1D1D"/>
-          <w:sz w:val="22"/>
-          <w:szCs w:val="22"/>
-        </w:rPr>
-        <w:t xml:space="preserve">daratumumab-containing quadruplet induction per current NICE technology appraisal (currently D-VTd per TA763, within NICE criteria), plus single ASCT, plus lenalidomide maintenance until progression (TA680). D-VRd (PERSEUS-based, GID-TA10726 / ID3843) is in development for transplant-unsuitable NDMM and is not a commissioned TE-NDMM option.</w:t>
+        <w:t>NDMM transplant-eligible (standard risk): daratumumab-containing quadruplet induction per current NICE technology appraisal (currently D-VTd per TA763, within NICE criteria), plus single ASCT, plus lenalidomide maintenance until progression (TA680). D-VRd (PERSEUS-based) is under separate NICE appraisal for transplant-eligible NDMM (GID-TA11254 / ID6249, in development; expected publication TBC) and is not yet a commissioned TE-NDMM option.</w:t>
       </w:r>
     </w:p>
     <w:p>
@@ -1616,17 +1537,7 @@
         <w:jc w:val="left"/>
       </w:pPr>
       <w:r>
-        <w:rPr>
-          <w:rFonts w:ascii="Georgia" w:cs="Georgia" w:eastAsia="Georgia" w:hAnsi="Georgia"/>
-          <w:b w:val="false"/>
-          <w:bCs w:val="false"/>
-          <w:i w:val="false"/>
-          <w:iCs w:val="false"/>
-          <w:color w:val="1D1D1D"/>
-          <w:sz w:val="22"/>
-          <w:szCs w:val="22"/>
-        </w:rPr>
-        <w:t xml:space="preserve">The following NICE-commissioned technology appraisals govern UK clinical practice for myeloma at the time of writing. Named entries re-verified for publication on 26 July 2026; live NICE verification remains required before prescribing. TA numbers and commissioning criteria are subject to revision. Several relevant appraisals are in development, in managed-access, or have been terminated, see Section 1A for the active landscape.</w:t>
+        <w:t>The following NICE-commissioned technology appraisals govern UK clinical practice for myeloma at the time of writing. Named entries re-verified for the v1.1 publication on 26 July 2026; live NICE verification remains required before prescribing. TA numbers and commissioning criteria are subject to revision. Several relevant appraisals are in development, in managed-access, or have been terminated, see Section 1A for the active landscape.</w:t>
       </w:r>
     </w:p>
     <w:p>
@@ -1792,17 +1703,7 @@
         <w:spacing w:after="40" w:before="40" w:line="280"/>
       </w:pPr>
       <w:r>
-        <w:rPr>
-          <w:rFonts w:ascii="Georgia" w:cs="Georgia" w:eastAsia="Georgia" w:hAnsi="Georgia"/>
-          <w:b w:val="false"/>
-          <w:bCs w:val="false"/>
-          <w:i w:val="false"/>
-          <w:iCs w:val="false"/>
-          <w:color w:val="1D1D1D"/>
-          <w:sz w:val="22"/>
-          <w:szCs w:val="22"/>
-        </w:rPr>
-        <w:t xml:space="preserve">GID-TA10726 / ID3843 — Daratumumab + bortezomib + lenalidomide + dexamethasone (D-VRd, PERSEUS-based) for untreated myeloma when stem cell transplant is unsuitable. Horizon / evidence only; NICE appraisal in development. Cited NICE in-development reference currently relates to transplant-unsuitable NDMM; verify live NICE indication before pathway placement. See Section 1A.</w:t>
+        <w:t>TA1170 — Daratumumab + bortezomib + lenalidomide + dexamethasone (D-VRd) for untreated multiple myeloma in adults when autologous stem cell transplant is unsuitable. Recommended by NICE on 24 June 2026, subject to the commercial arrangement. Confirm Blueteq, local formulary and implementation status before prescribing.</w:t>
       </w:r>
     </w:p>
     <w:p>
@@ -2249,15 +2150,7 @@
               <w:spacing w:after="80" w:before="0"/>
             </w:pPr>
             <w:r>
-              <w:rPr>
-                <w:rFonts w:ascii="Georgia" w:cs="Georgia" w:eastAsia="Georgia" w:hAnsi="Georgia"/>
-                <w:b/>
-                <w:bCs/>
-                <w:color w:val="1E5D8C"/>
-                <w:sz w:val="22"/>
-                <w:szCs w:val="22"/>
-              </w:rPr>
-              <w:t xml:space="preserve">Reviewer note</w:t>
+              <w:t>Governance note</w:t>
             </w:r>
           </w:p>
           <w:p>
@@ -2265,13 +2158,7 @@
               <w:spacing w:after="0" w:before="0" w:line="280"/>
             </w:pPr>
             <w:r>
-              <w:rPr>
-                <w:rFonts w:ascii="Georgia" w:cs="Georgia" w:eastAsia="Georgia" w:hAnsi="Georgia"/>
-                <w:color w:val="1D1D1D"/>
-                <w:sz w:val="22"/>
-                <w:szCs w:val="22"/>
-              </w:rPr>
-              <w:t xml:space="preserve">Pomalidomide + dex (TA427), elotuzumab, panobinostat (TA380), isatuximab combinations and several maintenance and earlier-line bispecific or CAR-T regimens have additional or older TAs; verify against the live NICE register before use. Daratumumab-containing quadruplet regimens for transplant-ineligible NDMM (D-Rd MAIA; D-VMP ALCYONE) are not explicitly linked to a verified NICE appraisal in this guideline, verify current NICE TA, Blueteq and local formulary status before use rather than presenting these as available.</w:t>
+              <w:t>Pomalidomide + dexamethasone (TA427), elotuzumab, panobinostat (TA380), isatuximab combinations and several maintenance and earlier-line bispecific or CAR-T regimens have additional or older TAs; verify against the live NICE register before use. D-VRd is separately recommended under TA1170 when ASCT is unsuitable. Other daratumumab-containing frontline regimens not explicitly linked to a verified NICE appraisal in this guideline must not be inferred to be commissioned; verify current NICE guidance, Blueteq and local formulary status.</w:t>
             </w:r>
           </w:p>
         </w:tc>
@@ -2571,15 +2458,7 @@
               <w:spacing w:after="0" w:before="0" w:line="260"/>
             </w:pPr>
             <w:r>
-              <w:rPr>
-                <w:rFonts w:ascii="Georgia" w:cs="Georgia" w:eastAsia="Georgia" w:hAnsi="Georgia"/>
-                <w:b w:val="false"/>
-                <w:bCs w:val="false"/>
-                <w:color w:val="1D1D1D"/>
-                <w:sz w:val="20"/>
-                <w:szCs w:val="20"/>
-              </w:rPr>
-              <w:t xml:space="preserve">D-VRd (daratumumab + bortezomib + lenalidomide + dexamethasone)</w:t>
+              <w:t>D-VRd (daratumumab + bortezomib + lenalidomide + dexamethasone)</w:t>
             </w:r>
           </w:p>
         </w:tc>
@@ -2604,15 +2483,7 @@
               <w:spacing w:after="0" w:before="0" w:line="260"/>
             </w:pPr>
             <w:r>
-              <w:rPr>
-                <w:rFonts w:ascii="Georgia" w:cs="Georgia" w:eastAsia="Georgia" w:hAnsi="Georgia"/>
-                <w:b w:val="false"/>
-                <w:bCs w:val="false"/>
-                <w:color w:val="1D1D1D"/>
-                <w:sz w:val="20"/>
-                <w:szCs w:val="20"/>
-              </w:rPr>
-              <w:t xml:space="preserve">Untreated myeloma when stem cell transplant is unsuitable</w:t>
+              <w:t>Untreated multiple myeloma when autologous stem cell transplant is unsuitable</w:t>
             </w:r>
           </w:p>
         </w:tc>
@@ -2637,15 +2508,7 @@
               <w:spacing w:after="0" w:before="0" w:line="260"/>
             </w:pPr>
             <w:r>
-              <w:rPr>
-                <w:rFonts w:ascii="Georgia" w:cs="Georgia" w:eastAsia="Georgia" w:hAnsi="Georgia"/>
-                <w:b w:val="false"/>
-                <w:bCs w:val="false"/>
-                <w:color w:val="1D1D1D"/>
-                <w:sz w:val="20"/>
-                <w:szCs w:val="20"/>
-              </w:rPr>
-              <w:t xml:space="preserve">In development: GID-TA10726 / ID3843. The previously listed NICE expected publication date of 13 May 2026 has passed; requires live NICE verification.</w:t>
+              <w:t>Recommended: TA1170, published 24 June 2026; subject to the commercial arrangement.</w:t>
             </w:r>
           </w:p>
         </w:tc>
@@ -2670,15 +2533,109 @@
               <w:spacing w:after="0" w:before="0" w:line="260"/>
             </w:pPr>
             <w:r>
-              <w:rPr>
-                <w:rFonts w:ascii="Georgia" w:cs="Georgia" w:eastAsia="Georgia" w:hAnsi="Georgia"/>
-                <w:b w:val="false"/>
-                <w:bCs w:val="false"/>
-                <w:color w:val="1D1D1D"/>
-                <w:sz w:val="20"/>
-                <w:szCs w:val="20"/>
-              </w:rPr>
-              <w:t xml:space="preserve">Treat as NICE horizon scanning only. Cited NICE in-development entry currently relates to transplant-unsuitable NDMM. Do not describe as routinely commissioned, and do not place D-VRd as a transplant-eligible NICE in-development option, unless final NICE guidance and Blueteq/formulary access confirm this.</w:t>
+              <w:t>Can be used routinely across the NHS in this population and must be funded in England within 90 days. Confirm Blueteq, local formulary and implementation status.</w:t>
+            </w:r>
+          </w:p>
+        </w:tc>
+      </w:tr>
+      <w:tr>
+        <w:tc>
+          <w:tcPr>
+            <w:tcW w:type="dxa" w:w="2200"/>
+            <w:tcBorders>
+              <w:top w:val="single" w:color="D8C9CB" w:sz="4"/>
+              <w:left w:val="single" w:color="D8C9CB" w:sz="4"/>
+              <w:bottom w:val="single" w:color="D8C9CB" w:sz="4"/>
+              <w:right w:val="single" w:color="D8C9CB" w:sz="4"/>
+            </w:tcBorders>
+            <w:tcMar>
+              <w:top w:type="dxa" w:w="80"/>
+              <w:left w:type="dxa" w:w="120"/>
+              <w:bottom w:type="dxa" w:w="80"/>
+              <w:right w:type="dxa" w:w="120"/>
+            </w:tcMar>
+          </w:tcPr>
+          <w:p>
+            <w:pPr>
+              <w:spacing w:after="0" w:before="0" w:line="260"/>
+            </w:pPr>
+            <w:r>
+              <w:t>D-VRd (daratumumab + bortezomib + lenalidomide + dexamethasone)</w:t>
+            </w:r>
+          </w:p>
+        </w:tc>
+        <w:tc>
+          <w:tcPr>
+            <w:tcW w:type="dxa" w:w="2200"/>
+            <w:tcBorders>
+              <w:top w:val="single" w:color="D8C9CB" w:sz="4"/>
+              <w:left w:val="single" w:color="D8C9CB" w:sz="4"/>
+              <w:bottom w:val="single" w:color="D8C9CB" w:sz="4"/>
+              <w:right w:val="single" w:color="D8C9CB" w:sz="4"/>
+            </w:tcBorders>
+            <w:tcMar>
+              <w:top w:type="dxa" w:w="80"/>
+              <w:left w:type="dxa" w:w="120"/>
+              <w:bottom w:type="dxa" w:w="80"/>
+              <w:right w:type="dxa" w:w="120"/>
+            </w:tcMar>
+          </w:tcPr>
+          <w:p>
+            <w:pPr>
+              <w:spacing w:after="0" w:before="0" w:line="260"/>
+            </w:pPr>
+            <w:r>
+              <w:t>Untreated myeloma when high-dose chemotherapy and autologous stem cell transplant are suitable</w:t>
+            </w:r>
+          </w:p>
+        </w:tc>
+        <w:tc>
+          <w:tcPr>
+            <w:tcW w:type="dxa" w:w="2200"/>
+            <w:tcBorders>
+              <w:top w:val="single" w:color="D8C9CB" w:sz="4"/>
+              <w:left w:val="single" w:color="D8C9CB" w:sz="4"/>
+              <w:bottom w:val="single" w:color="D8C9CB" w:sz="4"/>
+              <w:right w:val="single" w:color="D8C9CB" w:sz="4"/>
+            </w:tcBorders>
+            <w:tcMar>
+              <w:top w:type="dxa" w:w="80"/>
+              <w:left w:type="dxa" w:w="120"/>
+              <w:bottom w:type="dxa" w:w="80"/>
+              <w:right w:type="dxa" w:w="120"/>
+            </w:tcMar>
+          </w:tcPr>
+          <w:p>
+            <w:pPr>
+              <w:spacing w:after="0" w:before="0" w:line="260"/>
+            </w:pPr>
+            <w:r>
+              <w:t>In development: GID-TA11254 / ID6249; expected publication TBC.</w:t>
+            </w:r>
+          </w:p>
+        </w:tc>
+        <w:tc>
+          <w:tcPr>
+            <w:tcW w:type="dxa" w:w="2426"/>
+            <w:tcBorders>
+              <w:top w:val="single" w:color="D8C9CB" w:sz="4"/>
+              <w:left w:val="single" w:color="D8C9CB" w:sz="4"/>
+              <w:bottom w:val="single" w:color="D8C9CB" w:sz="4"/>
+              <w:right w:val="single" w:color="D8C9CB" w:sz="4"/>
+            </w:tcBorders>
+            <w:tcMar>
+              <w:top w:type="dxa" w:w="80"/>
+              <w:left w:type="dxa" w:w="120"/>
+              <w:bottom w:type="dxa" w:w="80"/>
+              <w:right w:type="dxa" w:w="120"/>
+            </w:tcMar>
+          </w:tcPr>
+          <w:p>
+            <w:pPr>
+              <w:spacing w:after="0" w:before="0" w:line="260"/>
+            </w:pPr>
+            <w:r>
+              <w:t>Separate transplant-eligible appraisal. Not NICE-commissioned for this setting unless final guidance and local access confirm it.</w:t>
             </w:r>
           </w:p>
         </w:tc>
@@ -4062,29 +4019,9 @@
               <w:spacing w:after="80" w:before="0"/>
             </w:pPr>
             <w:r>
-              <w:rPr>
-                <w:rFonts w:ascii="Georgia" w:cs="Georgia" w:eastAsia="Georgia" w:hAnsi="Georgia"/>
-                <w:b/>
-                <w:bCs/>
-                <w:color w:val="C87A00"/>
-                <w:sz w:val="22"/>
-                <w:szCs w:val="22"/>
-              </w:rPr>
-              <w:t xml:space="preserve">Verification requirements before any clinical use</w:t>
-            </w:r>
-          </w:p>
-          <w:p>
-            <w:pPr>
-              <w:spacing w:after="0" w:before="0" w:line="280"/>
-            </w:pPr>
-            <w:r>
-              <w:rPr>
-                <w:rFonts w:ascii="Georgia" w:cs="Georgia" w:eastAsia="Georgia" w:hAnsi="Georgia"/>
-                <w:color w:val="1D1D1D"/>
-                <w:sz w:val="22"/>
-                <w:szCs w:val="22"/>
-              </w:rPr>
-              <w:t xml:space="preserve">NICE horizon-scanning section checked against live NICE pages immediately before deployment. Distinction confirmed between currently recommended, managed-access, in-development, awaiting-development, discontinued and terminated appraisals. D-VRd identifier verified as GID-TA10726 / ID3843 unless NICE has since issued final TA guidance with a new TA number. Cilta-cel TA889 (terminated) and GID-TA10905 / ID4012 (in development) kept separate at every point in this document. Ixazomib maintenance GID-TA10843 labelled discontinued, not in development, at every point in this document.</w:t>
+              <w:t>Verification requirements before any clinical use</w:t>
+              <w:br/>
+              <w:t>D-VRd settings kept separate: TA1170 for untreated myeloma when ASCT is unsuitable; GID-TA11254 / ID6249 remains in development when high-dose chemotherapy and ASCT are suitable. Live NICE, Blueteq, local formulary, SmPC and pharmacy verification remain mandatory.</w:t>
             </w:r>
           </w:p>
         </w:tc>
@@ -10227,17 +10164,7 @@
         <w:spacing w:after="40" w:before="40" w:line="280"/>
       </w:pPr>
       <w:r>
-        <w:rPr>
-          <w:rFonts w:ascii="Georgia" w:cs="Georgia" w:eastAsia="Georgia" w:hAnsi="Georgia"/>
-          <w:b w:val="false"/>
-          <w:bCs w:val="false"/>
-          <w:i w:val="false"/>
-          <w:iCs w:val="false"/>
-          <w:color w:val="1D1D1D"/>
-          <w:sz w:val="22"/>
-          <w:szCs w:val="22"/>
-        </w:rPr>
-        <w:t xml:space="preserve">QuiRedex and SWOG E3A06 showed benefit from early lenalidomide-based therapy in high-risk SMM. Treatment of SMM is not NHS standard of care outside trials as at the v1.0 publication review.</w:t>
+        <w:t>QuiRedex and SWOG E3A06 showed benefit from early lenalidomide-based therapy in high-risk SMM. Treatment of SMM is not NHS standard of care outside trials as at the v1.1 publication review.</w:t>
       </w:r>
     </w:p>
     <w:p>
@@ -12844,17 +12771,7 @@
         <w:jc w:val="left"/>
       </w:pPr>
       <w:r>
-        <w:rPr>
-          <w:rFonts w:ascii="Georgia" w:cs="Georgia" w:eastAsia="Georgia" w:hAnsi="Georgia"/>
-          <w:b w:val="false"/>
-          <w:bCs w:val="false"/>
-          <w:i w:val="false"/>
-          <w:iCs w:val="false"/>
-          <w:color w:val="1D1D1D"/>
-          <w:sz w:val="22"/>
-          <w:szCs w:val="22"/>
-        </w:rPr>
-        <w:t xml:space="preserve">Standard UK NHS induction has been a bortezomib-based triplet (most commonly VTd or VCd) followed by ASCT with melphalan 200 mg/m squared conditioning and lenalidomide maintenance until progression (TA680). Daratumumab-containing quadruplet induction is increasingly used in line with the CASSIOPEIA evidence base and current NICE technology appraisals. The current NICE-commissioned quadruplet for the transplant-eligible setting is D-VTd (TA763, within NICE criteria). D-VRd (PERSEUS-based) is the subject of an in-development NICE appraisal under identifier GID-TA10726 / ID3843 (the v0.3 draft incorrectly cited TA11254 — corrected in v0.4); the cited NICE in-development reference relates to transplant-unsuitable NDMM, not transplant-eligible disease. D-VRd should be treated as horizon/evidence content only for the TE-NDMM pathway pending final NICE guidance and verified pathway placement.</w:t>
+        <w:t>Standard UK NHS induction has been a bortezomib-based triplet (most commonly VTd or VCd) followed by ASCT with melphalan 200 mg/m squared conditioning and lenalidomide maintenance until progression (TA680). Daratumumab-containing quadruplet induction is increasingly used in line with the CASSIOPEIA evidence base and current NICE technology appraisals. The current NICE-commissioned quadruplet for the transplant-eligible setting is D-VTd (TA763, within NICE criteria). D-VRd (PERSEUS-based) is under separate NICE appraisal for untreated myeloma when high-dose chemotherapy and autologous stem cell transplant are suitable (GID-TA11254 / ID6249, in development; expected publication TBC). D-VRd remains horizon/evidence content only for the transplant-eligible pathway pending final NICE guidance and verified pathway placement.</w:t>
       </w:r>
     </w:p>
     <w:tbl>
@@ -13761,72 +13678,6 @@
         <w:t xml:space="preserve">Pragmatic option in older or frail patients. Dose-reduce dexamethasone to 20 mg weekly in those aged 75 or over or frail by IMWG frailty score. Continuous lenalidomide (Rd) outperforms fixed-duration Rd18.</w:t>
       </w:r>
     </w:p>
-    <w:tbl>
-      <w:tblPr>
-        <w:tblW w:type="dxa" w:w="9026"/>
-        <w:tblBorders>
-          <w:top w:val="single" w:color="auto" w:sz="4"/>
-          <w:left w:val="single" w:color="auto" w:sz="4"/>
-          <w:bottom w:val="single" w:color="auto" w:sz="4"/>
-          <w:right w:val="single" w:color="auto" w:sz="4"/>
-          <w:insideH w:val="single" w:color="auto" w:sz="4"/>
-          <w:insideV w:val="single" w:color="auto" w:sz="4"/>
-        </w:tblBorders>
-      </w:tblPr>
-      <w:tblGrid>
-        <w:gridCol w:w="9026"/>
-      </w:tblGrid>
-      <w:tr>
-        <w:tc>
-          <w:tcPr>
-            <w:tcW w:type="dxa" w:w="9026"/>
-            <w:tcBorders>
-              <w:top w:val="single" w:color="D8C9CB" w:sz="4"/>
-              <w:left w:val="single" w:color="C87A00" w:sz="16"/>
-              <w:bottom w:val="single" w:color="D8C9CB" w:sz="4"/>
-              <w:right w:val="single" w:color="D8C9CB" w:sz="4"/>
-            </w:tcBorders>
-            <w:shd w:fill="FFF4E0" w:val="clear"/>
-            <w:tcMar>
-              <w:top w:type="dxa" w:w="140"/>
-              <w:left w:type="dxa" w:w="200"/>
-              <w:bottom w:type="dxa" w:w="140"/>
-              <w:right w:type="dxa" w:w="160"/>
-            </w:tcMar>
-          </w:tcPr>
-          <w:p>
-            <w:pPr>
-              <w:spacing w:after="80" w:before="0"/>
-            </w:pPr>
-            <w:r>
-              <w:rPr>
-                <w:rFonts w:ascii="Georgia" w:cs="Georgia" w:eastAsia="Georgia" w:hAnsi="Georgia"/>
-                <w:b/>
-                <w:bCs/>
-                <w:color w:val="C87A00"/>
-                <w:sz w:val="22"/>
-                <w:szCs w:val="22"/>
-              </w:rPr>
-              <w:t xml:space="preserve">Reviewer note — daratumumab-containing quadruplets for transplant-ineligible NDMM</w:t>
-            </w:r>
-          </w:p>
-          <w:p>
-            <w:pPr>
-              <w:spacing w:after="0" w:before="0" w:line="280"/>
-            </w:pPr>
-            <w:r>
-              <w:rPr>
-                <w:rFonts w:ascii="Georgia" w:cs="Georgia" w:eastAsia="Georgia" w:hAnsi="Georgia"/>
-                <w:color w:val="1D1D1D"/>
-                <w:sz w:val="22"/>
-                <w:szCs w:val="22"/>
-              </w:rPr>
-              <w:t xml:space="preserve">Daratumumab-containing quadruplet regimens for transplant-ineligible NDMM (D-Rd per MAIA; D-VMP per ALCYONE) are not explicitly linked to a verified NICE appraisal in this guideline. Verify current NICE TA, Blueteq and local formulary status before use rather than presenting these regimens as available. Isa-VRd is listed under TA1098 for untreated myeloma when stem cell transplant is unsuitable.</w:t>
-            </w:r>
-          </w:p>
-        </w:tc>
-      </w:tr>
-    </w:tbl>
     <w:p>
       <w:pPr>
         <w:spacing w:after="40" w:before="160" w:line="300"/>
@@ -14025,17 +13876,7 @@
         <w:jc w:val="left"/>
       </w:pPr>
       <w:r>
-        <w:rPr>
-          <w:rFonts w:ascii="Georgia" w:cs="Georgia" w:eastAsia="Georgia" w:hAnsi="Georgia"/>
-          <w:b/>
-          <w:bCs/>
-          <w:i w:val="false"/>
-          <w:iCs w:val="false"/>
-          <w:color w:val="7A1F2B"/>
-          <w:sz w:val="23"/>
-          <w:szCs w:val="23"/>
-        </w:rPr>
-        <w:t xml:space="preserve">Daratumumab + bortezomib + lenalidomide + dexamethasone (D-VRd, PERSEUS) — horizon/evidence only</w:t>
+        <w:t>Daratumumab + bortezomib + lenalidomide + dexamethasone (D-VRd) — transplant-ineligible NDMM</w:t>
       </w:r>
     </w:p>
     <w:p>
@@ -14044,43 +13885,7 @@
         <w:jc w:val="left"/>
       </w:pPr>
       <w:r>
-        <w:rPr>
-          <w:rFonts w:ascii="Georgia" w:cs="Georgia" w:eastAsia="Georgia" w:hAnsi="Georgia"/>
-          <w:b/>
-          <w:bCs/>
-          <w:i w:val="false"/>
-          <w:iCs w:val="false"/>
-          <w:color w:val="C87A00"/>
-          <w:sz w:val="20"/>
-          <w:szCs w:val="20"/>
-        </w:rPr>
-        <w:t xml:space="preserve">NICE GID-TA10726 / ID3843 — in development</w:t>
-      </w:r>
-      <w:r>
-        <w:rPr>
-          <w:rFonts w:ascii="Georgia" w:cs="Georgia" w:eastAsia="Georgia" w:hAnsi="Georgia"/>
-          <w:b w:val="false"/>
-          <w:bCs w:val="false"/>
-          <w:i w:val="false"/>
-          <w:iCs w:val="false"/>
-          <w:color w:val="1D1D1D"/>
-          <w:sz w:val="22"/>
-          <w:szCs w:val="22"/>
-        </w:rPr>
-        <w:t xml:space="preserve">   </w:t>
-      </w:r>
-      <w:r>
-        <w:rPr>
-          <w:rFonts w:ascii="Georgia" w:cs="Georgia" w:eastAsia="Georgia" w:hAnsi="Georgia"/>
-          <w:b/>
-          <w:bCs/>
-          <w:i w:val="false"/>
-          <w:iCs w:val="false"/>
-          <w:color w:val="2A6B3B"/>
-          <w:sz w:val="20"/>
-          <w:szCs w:val="20"/>
-        </w:rPr>
-        <w:t xml:space="preserve">High / Strong (trial evidence)</w:t>
+        <w:t>NICE TA1170 — recommended for ASCT-unsuitable untreated myeloma</w:t>
       </w:r>
     </w:p>
     <w:p>
@@ -14089,30 +13894,7 @@
         <w:jc w:val="left"/>
       </w:pPr>
       <w:r>
-        <w:rPr>
-          <w:rFonts w:ascii="Georgia" w:cs="Georgia" w:eastAsia="Georgia" w:hAnsi="Georgia"/>
-          <w:b/>
-          <w:bCs/>
-          <w:i w:val="false"/>
-          <w:iCs w:val="false"/>
-          <w:color w:val="1D1D1D"/>
-          <w:sz w:val="22"/>
-          <w:szCs w:val="22"/>
-        </w:rPr>
-        <w:t xml:space="preserve">Pathway placement: </w:t>
-      </w:r>
-      <w:r>
-        <w:rPr>
-          <w:rFonts w:ascii="Georgia" w:cs="Georgia" w:eastAsia="Georgia" w:hAnsi="Georgia"/>
-          <w:b w:val="false"/>
-          <w:bCs w:val="false"/>
-          <w:i w:val="false"/>
-          <w:iCs w:val="false"/>
-          <w:color w:val="1D1D1D"/>
-          <w:sz w:val="22"/>
-          <w:szCs w:val="22"/>
-        </w:rPr>
-        <w:t xml:space="preserve">Horizon/evidence only. Cited NICE GID-TA10726 / ID3843 currently relates to untreated myeloma when stem cell transplant is unsuitable. Verify live NICE indication before pathway placement. Not commissioned for the transplant-eligible setting.</w:t>
+        <w:t>Pathway placement: NICE-recommended under TA1170 for untreated multiple myeloma in adults when autologous stem cell transplant is unsuitable, subject to the commercial arrangement.</w:t>
       </w:r>
     </w:p>
     <w:p>
@@ -14121,30 +13903,7 @@
         <w:jc w:val="left"/>
       </w:pPr>
       <w:r>
-        <w:rPr>
-          <w:rFonts w:ascii="Georgia" w:cs="Georgia" w:eastAsia="Georgia" w:hAnsi="Georgia"/>
-          <w:b/>
-          <w:bCs/>
-          <w:i w:val="false"/>
-          <w:iCs w:val="false"/>
-          <w:color w:val="1D1D1D"/>
-          <w:sz w:val="22"/>
-          <w:szCs w:val="22"/>
-        </w:rPr>
-        <w:t xml:space="preserve">Dose: </w:t>
-      </w:r>
-      <w:r>
-        <w:rPr>
-          <w:rFonts w:ascii="Georgia" w:cs="Georgia" w:eastAsia="Georgia" w:hAnsi="Georgia"/>
-          <w:b w:val="false"/>
-          <w:bCs w:val="false"/>
-          <w:i w:val="false"/>
-          <w:iCs w:val="false"/>
-          <w:color w:val="1D1D1D"/>
-          <w:sz w:val="22"/>
-          <w:szCs w:val="22"/>
-        </w:rPr>
-        <w:t xml:space="preserve">Daratumumab subcutaneous schedule + bortezomib 1.3 mg/m squared SC + lenalidomide 25 mg PO days 1 to 21 + dexamethasone, in 28-day cycles, induction (four cycles), ASCT (in the PERSEUS trial), consolidation (two cycles), D-R maintenance. Dose example only — verify against current SmPC, local e-prescribing protocol, renal/hepatic and frailty modifications, and pharmacy verification before any prescribing.</w:t>
+        <w:t>Dose: Use the current SmPC and a pharmacy-controlled local protocol. No dose example is provided here for the TA1170 pathway. Verify renal/hepatic and frailty modifications, drug interactions, Blueteq, local formulary implementation and pharmacy approval before prescribing.</w:t>
       </w:r>
     </w:p>
     <w:p>
@@ -14153,30 +13912,7 @@
         <w:jc w:val="left"/>
       </w:pPr>
       <w:r>
-        <w:rPr>
-          <w:rFonts w:ascii="Georgia" w:cs="Georgia" w:eastAsia="Georgia" w:hAnsi="Georgia"/>
-          <w:b/>
-          <w:bCs/>
-          <w:i w:val="false"/>
-          <w:iCs w:val="false"/>
-          <w:color w:val="1D1D1D"/>
-          <w:sz w:val="22"/>
-          <w:szCs w:val="22"/>
-        </w:rPr>
-        <w:t xml:space="preserve">Trial basis: </w:t>
-      </w:r>
-      <w:r>
-        <w:rPr>
-          <w:rFonts w:ascii="Georgia" w:cs="Georgia" w:eastAsia="Georgia" w:hAnsi="Georgia"/>
-          <w:b w:val="false"/>
-          <w:bCs w:val="false"/>
-          <w:i w:val="false"/>
-          <w:iCs w:val="false"/>
-          <w:color w:val="1D1D1D"/>
-          <w:sz w:val="22"/>
-          <w:szCs w:val="22"/>
-        </w:rPr>
-        <w:t xml:space="preserve">PERSEUS (Sonneveld et al., NEJM 2024). D-VRd induction and consolidation with D-R maintenance improved PFS over VRd with R maintenance, with deeper MRD response. PERSEUS was conducted in transplant-eligible NDMM; the NICE in-development appraisal under GID-TA10726 / ID3843 addresses the transplant-unsuitable population specifically.</w:t>
+        <w:t>NICE TA: TA1170, published 24 June 2026. NICE states that D-VRd can be used routinely across the NHS in this population and must be funded in England within 90 days of final publication.</w:t>
       </w:r>
     </w:p>
     <w:p>
@@ -14185,30 +13921,7 @@
         <w:jc w:val="left"/>
       </w:pPr>
       <w:r>
-        <w:rPr>
-          <w:rFonts w:ascii="Georgia" w:cs="Georgia" w:eastAsia="Georgia" w:hAnsi="Georgia"/>
-          <w:b/>
-          <w:bCs/>
-          <w:i w:val="false"/>
-          <w:iCs w:val="false"/>
-          <w:color w:val="1D1D1D"/>
-          <w:sz w:val="22"/>
-          <w:szCs w:val="22"/>
-        </w:rPr>
-        <w:t xml:space="preserve">Notes: Not presented as routinely commissioned in this guideline.</w:t>
-      </w:r>
-      <w:r>
-        <w:rPr>
-          <w:rFonts w:ascii="Georgia" w:cs="Georgia" w:eastAsia="Georgia" w:hAnsi="Georgia"/>
-          <w:b w:val="false"/>
-          <w:bCs w:val="false"/>
-          <w:i w:val="false"/>
-          <w:iCs w:val="false"/>
-          <w:color w:val="1D1D1D"/>
-          <w:sz w:val="22"/>
-          <w:szCs w:val="22"/>
-        </w:rPr>
-        <w:t xml:space="preserve"> The v0.3 draft incorrectly cited TA11254; corrected to GID-TA10726 / ID3843 in v0.4 and the indication clarified as transplant-unsuitable in v0.4.1. Do not present as routinely commissioned. See Section 1A NICE Horizon Scanning.</w:t>
+        <w:t>Notes: Keep this transplant-ineligible recommendation separate from the transplant-eligible appraisal GID-TA11254 / ID6249, which remains in development. Confirm Blueteq, local formulary implementation and pharmacy approval before prescribing.</w:t>
       </w:r>
     </w:p>
     <w:p>
@@ -24481,17 +24194,7 @@
         <w:spacing w:after="40" w:before="40" w:line="280"/>
       </w:pPr>
       <w:r>
-        <w:rPr>
-          <w:rFonts w:ascii="Georgia" w:cs="Georgia" w:eastAsia="Georgia" w:hAnsi="Georgia"/>
-          <w:b w:val="false"/>
-          <w:bCs w:val="false"/>
-          <w:i w:val="false"/>
-          <w:iCs w:val="false"/>
-          <w:color w:val="1D1D1D"/>
-          <w:sz w:val="22"/>
-          <w:szCs w:val="22"/>
-        </w:rPr>
-        <w:t xml:space="preserve">D-VRd identifier confirmed as GID-TA10726 / ID3843 unless NICE has since issued final TA guidance with a new TA number, in which case replace throughout.</w:t>
+        <w:t>D-VRd settings kept separate throughout: TA1170 when ASCT is unsuitable; GID-TA11254 / ID6249 remains in development when high-dose chemotherapy and ASCT are suitable.</w:t>
       </w:r>
     </w:p>
     <w:p>
@@ -24681,17 +24384,7 @@
         <w:spacing w:after="40" w:before="40" w:line="280"/>
       </w:pPr>
       <w:r>
-        <w:rPr>
-          <w:rFonts w:ascii="Georgia" w:cs="Georgia" w:eastAsia="Georgia" w:hAnsi="Georgia"/>
-          <w:b w:val="false"/>
-          <w:bCs w:val="false"/>
-          <w:i w:val="false"/>
-          <w:iCs w:val="false"/>
-          <w:color w:val="1D1D1D"/>
-          <w:sz w:val="22"/>
-          <w:szCs w:val="22"/>
-        </w:rPr>
-        <w:t xml:space="preserve">Several relevant appraisals remain in development: GID-TA10726 / ID3843 (D-VRd), TA11465 (isatuximab combinations induction), GID-TA10905 / ID4012 (cilta-cel earlier line), GID-TA11846 / ID6639 (isatuximab maintenance). This document will be updated when relevant guidance is published.</w:t>
+        <w:t>D-VRd is recommended for transplant-ineligible NDMM under TA1170; the separate transplant-eligible appraisal GID-TA11254 / ID6249 remains in development. Other relevant appraisals remain in development, including TA11465, GID-TA10905 / ID4012 and GID-TA11846 / ID6639.</w:t>
       </w:r>
     </w:p>
     <w:p>
@@ -27335,17 +27028,7 @@
         <w:spacing w:after="40" w:before="40" w:line="280"/>
       </w:pPr>
       <w:r>
-        <w:rPr>
-          <w:rFonts w:ascii="Georgia" w:cs="Georgia" w:eastAsia="Georgia" w:hAnsi="Georgia"/>
-          <w:b w:val="false"/>
-          <w:bCs w:val="false"/>
-          <w:i w:val="false"/>
-          <w:iCs w:val="false"/>
-          <w:color w:val="1D1D1D"/>
-          <w:sz w:val="22"/>
-          <w:szCs w:val="22"/>
-        </w:rPr>
-        <w:t xml:space="preserve">In development: GID-TA10726 / ID3843 (D-VRd, PERSEUS); GID-TA10905 / ID4012 (cilta-cel after 1 to 3 therapies); GID-TA11846 / ID6639 (isatuximab maintenance after ASCT).</w:t>
+        <w:t>TA1170: D-VRd for untreated multiple myeloma when ASCT is unsuitable. In development: GID-TA11254 / ID6249 (D-VRd when high-dose chemotherapy and ASCT are suitable); GID-TA10905 / ID4012; GID-TA11846 / ID6639.</w:t>
       </w:r>
     </w:p>
     <w:p>
@@ -28582,6 +28265,48 @@
           <w:p>
             <w:r>
               <w:t>First published release. Consultant approval and pharmacy verification confirmed by the clinical owner. NICE/appraisal status, Blueteq and formulary controls, dose and adjustment language, supportive-care controls, approved-centre pathways and belantamab ophthalmology pathway confirmed checked. Publication status and metadata updated; clinical recommendations unchanged from v0.4.1.</w:t>
+            </w:r>
+          </w:p>
+        </w:tc>
+      </w:tr>
+      <w:tr>
+        <w:tc>
+          <w:tcPr>
+            <w:tcW w:type="dxa" w:w="1200"/>
+          </w:tcPr>
+          <w:p>
+            <w:r>
+              <w:t>v1.1 PUBLISHED</w:t>
+            </w:r>
+          </w:p>
+        </w:tc>
+        <w:tc>
+          <w:tcPr>
+            <w:tcW w:type="dxa" w:w="1400"/>
+          </w:tcPr>
+          <w:p>
+            <w:r>
+              <w:t>26 July 2026</w:t>
+            </w:r>
+          </w:p>
+        </w:tc>
+        <w:tc>
+          <w:tcPr>
+            <w:tcW w:type="dxa" w:w="2400"/>
+          </w:tcPr>
+          <w:p>
+            <w:r>
+              <w:t>Dr M Mohsin</w:t>
+            </w:r>
+          </w:p>
+        </w:tc>
+        <w:tc>
+          <w:tcPr>
+            <w:tcW w:type="dxa" w:w="4026"/>
+          </w:tcPr>
+          <w:p>
+            <w:r>
+              <w:t>D-VRd is NICE-recommended under TA1170 when ASCT is unsuitable; separate transplant-eligible appraisal GID-TA11254 / ID6249 remains in development. Clinical owner approval and pharmacy verification confirmed; pharmacist's name retained privately.</w:t>
             </w:r>
           </w:p>
         </w:tc>
@@ -28854,15 +28579,7 @@
       <w:jc w:val="left"/>
     </w:pPr>
     <w:r>
-      <w:rPr>
-        <w:rFonts w:ascii="Georgia" w:cs="Georgia" w:eastAsia="Georgia" w:hAnsi="Georgia"/>
-        <w:b/>
-        <w:bCs/>
-        <w:color w:val="7A1F2B"/>
-        <w:sz w:val="18"/>
-        <w:szCs w:val="18"/>
-      </w:rPr>
-      <w:t>MHA-MYELOMA-2026-v1.0 (PUBLISHED)</w:t>
+      <w:t>MHA-MYELOMA-2026-v1.1 (PUBLISHED)</w:t>
     </w:r>
   </w:p>
 </w:hdr>

</xml_diff>